<commit_message>
Added userstories for functional requirements
</commit_message>
<xml_diff>
--- a/ASGMNT3/JHET_Innovations-Assignment3-SRS.docx
+++ b/ASGMNT3/JHET_Innovations-Assignment3-SRS.docx
@@ -2328,10 +2328,7 @@
               <w:spacing w:before="40" w:after="40"/>
             </w:pPr>
             <w:r>
-              <w:t>1.</w:t>
-            </w:r>
-            <w:r>
-              <w:t>1</w:t>
+              <w:t>1.1</w:t>
             </w:r>
           </w:p>
         </w:tc>
@@ -2584,7 +2581,7 @@
           <w14:ligatures w14:val="standardContextual"/>
         </w:rPr>
         <w:pict w14:anchorId="026D9251">
-          <v:rect id="_x0000_i1146" style="width:0;height:1.5pt" o:hralign="center" o:hrstd="t" o:hr="t" fillcolor="#a0a0a0" stroked="f"/>
+          <v:rect id="_x0000_i1025" style="width:0;height:1.5pt" o:hralign="center" o:hrstd="t" o:hr="t" fillcolor="#a0a0a0" stroked="f"/>
         </w:pict>
       </w:r>
     </w:p>
@@ -2748,7 +2745,7 @@
           <w:szCs w:val="24"/>
         </w:rPr>
         <w:pict w14:anchorId="4092ECE4">
-          <v:rect id="_x0000_i1147" style="width:0;height:1.5pt" o:hralign="center" o:hrstd="t" o:hr="t" fillcolor="#a0a0a0" stroked="f"/>
+          <v:rect id="_x0000_i1026" style="width:0;height:1.5pt" o:hralign="center" o:hrstd="t" o:hr="t" fillcolor="#a0a0a0" stroked="f"/>
         </w:pict>
       </w:r>
     </w:p>
@@ -3258,7 +3255,7 @@
           <w:szCs w:val="24"/>
         </w:rPr>
         <w:pict w14:anchorId="5F96BAE6">
-          <v:rect id="_x0000_i1148" style="width:0;height:1.5pt" o:hralign="center" o:hrstd="t" o:hr="t" fillcolor="#a0a0a0" stroked="f"/>
+          <v:rect id="_x0000_i1027" style="width:0;height:1.5pt" o:hralign="center" o:hrstd="t" o:hr="t" fillcolor="#a0a0a0" stroked="f"/>
         </w:pict>
       </w:r>
     </w:p>
@@ -3344,7 +3341,7 @@
           <w:szCs w:val="24"/>
         </w:rPr>
         <w:pict w14:anchorId="348CF2C1">
-          <v:rect id="_x0000_i1149" style="width:0;height:1.5pt" o:hralign="center" o:hrstd="t" o:hr="t" fillcolor="#a0a0a0" stroked="f"/>
+          <v:rect id="_x0000_i1028" style="width:0;height:1.5pt" o:hralign="center" o:hrstd="t" o:hr="t" fillcolor="#a0a0a0" stroked="f"/>
         </w:pict>
       </w:r>
     </w:p>
@@ -3631,27 +3628,7 @@
             <w:szCs w:val="24"/>
             <w14:ligatures w14:val="standardContextual"/>
           </w:rPr>
-          <w:t>https://github.com/hud</w:t>
-        </w:r>
-        <w:r>
-          <w:rPr>
-            <w:rStyle w:val="Hyperlink"/>
-            <w:rFonts w:ascii="Times New Roman" w:eastAsiaTheme="minorHAnsi" w:hAnsi="Times New Roman"/>
-            <w:kern w:val="2"/>
-            <w:szCs w:val="24"/>
-            <w14:ligatures w14:val="standardContextual"/>
-          </w:rPr>
-          <w:t>c</w:t>
-        </w:r>
-        <w:r>
-          <w:rPr>
-            <w:rStyle w:val="Hyperlink"/>
-            <w:rFonts w:ascii="Times New Roman" w:eastAsiaTheme="minorHAnsi" w:hAnsi="Times New Roman"/>
-            <w:kern w:val="2"/>
-            <w:szCs w:val="24"/>
-            <w14:ligatures w14:val="standardContextual"/>
-          </w:rPr>
-          <w:t>ho/Studious/</w:t>
+          <w:t>https://github.com/hudcho/Studious/</w:t>
         </w:r>
       </w:hyperlink>
       <w:r>
@@ -3676,7 +3653,7 @@
           <w:szCs w:val="24"/>
         </w:rPr>
         <w:pict w14:anchorId="1E49B0DB">
-          <v:rect id="_x0000_i1150" style="width:0;height:1.5pt" o:hralign="center" o:hrstd="t" o:hr="t" fillcolor="#a0a0a0" stroked="f"/>
+          <v:rect id="_x0000_i1029" style="width:0;height:1.5pt" o:hralign="center" o:hrstd="t" o:hr="t" fillcolor="#a0a0a0" stroked="f"/>
         </w:pict>
       </w:r>
     </w:p>
@@ -3734,12 +3711,21 @@
           <w:szCs w:val="24"/>
         </w:rPr>
       </w:pPr>
-      <w:r>
-        <w:rPr>
-          <w:rFonts w:ascii="Times New Roman" w:hAnsi="Times New Roman"/>
-          <w:szCs w:val="24"/>
-        </w:rPr>
-        <w:t xml:space="preserve">Studious is a </w:t>
+      <w:proofErr w:type="gramStart"/>
+      <w:r>
+        <w:rPr>
+          <w:rFonts w:ascii="Times New Roman" w:hAnsi="Times New Roman"/>
+          <w:szCs w:val="24"/>
+        </w:rPr>
+        <w:t>Studious</w:t>
+      </w:r>
+      <w:proofErr w:type="gramEnd"/>
+      <w:r>
+        <w:rPr>
+          <w:rFonts w:ascii="Times New Roman" w:hAnsi="Times New Roman"/>
+          <w:szCs w:val="24"/>
+        </w:rPr>
+        <w:t xml:space="preserve"> is a </w:t>
       </w:r>
       <w:r>
         <w:rPr>
@@ -3916,7 +3902,23 @@
           <w:rFonts w:ascii="Times New Roman" w:hAnsi="Times New Roman"/>
           <w:szCs w:val="24"/>
         </w:rPr>
-        <w:t xml:space="preserve"> Frontend hosted on Vercel, Backend hosted on Render</w:t>
+        <w:t xml:space="preserve"> Frontend hosted on </w:t>
+      </w:r>
+      <w:proofErr w:type="spellStart"/>
+      <w:r>
+        <w:rPr>
+          <w:rFonts w:ascii="Times New Roman" w:hAnsi="Times New Roman"/>
+          <w:szCs w:val="24"/>
+        </w:rPr>
+        <w:t>Vercel</w:t>
+      </w:r>
+      <w:proofErr w:type="spellEnd"/>
+      <w:r>
+        <w:rPr>
+          <w:rFonts w:ascii="Times New Roman" w:hAnsi="Times New Roman"/>
+          <w:szCs w:val="24"/>
+        </w:rPr>
+        <w:t>, Backend hosted on Render</w:t>
       </w:r>
     </w:p>
     <w:p>
@@ -4173,8 +4175,17 @@
           <w:rFonts w:ascii="Courier New" w:hAnsi="Courier New" w:cs="Courier New"/>
           <w:sz w:val="20"/>
         </w:rPr>
-        <w:t xml:space="preserve">                v       v</w:t>
-      </w:r>
+        <w:t xml:space="preserve">                v       </w:t>
+      </w:r>
+      <w:proofErr w:type="spellStart"/>
+      <w:r>
+        <w:rPr>
+          <w:rFonts w:ascii="Courier New" w:hAnsi="Courier New" w:cs="Courier New"/>
+          <w:sz w:val="20"/>
+        </w:rPr>
+        <w:t>v</w:t>
+      </w:r>
+      <w:proofErr w:type="spellEnd"/>
     </w:p>
     <w:p>
       <w:pPr>
@@ -4207,7 +4218,39 @@
           <w:rFonts w:ascii="Courier New" w:hAnsi="Courier New" w:cs="Courier New"/>
           <w:sz w:val="20"/>
         </w:rPr>
-        <w:t xml:space="preserve">   +----------------+   +----------------+</w:t>
+        <w:t xml:space="preserve">   </w:t>
+      </w:r>
+      <w:proofErr w:type="gramStart"/>
+      <w:r>
+        <w:rPr>
+          <w:rFonts w:ascii="Courier New" w:hAnsi="Courier New" w:cs="Courier New"/>
+          <w:sz w:val="20"/>
+        </w:rPr>
+        <w:t>+-</w:t>
+      </w:r>
+      <w:proofErr w:type="gramEnd"/>
+      <w:r>
+        <w:rPr>
+          <w:rFonts w:ascii="Courier New" w:hAnsi="Courier New" w:cs="Courier New"/>
+          <w:sz w:val="20"/>
+        </w:rPr>
+        <w:t xml:space="preserve">---------------+ </w:t>
+      </w:r>
+      <w:proofErr w:type="gramStart"/>
+      <w:r>
+        <w:rPr>
+          <w:rFonts w:ascii="Courier New" w:hAnsi="Courier New" w:cs="Courier New"/>
+          <w:sz w:val="20"/>
+        </w:rPr>
+        <w:t xml:space="preserve">  +-</w:t>
+      </w:r>
+      <w:proofErr w:type="gramEnd"/>
+      <w:r>
+        <w:rPr>
+          <w:rFonts w:ascii="Courier New" w:hAnsi="Courier New" w:cs="Courier New"/>
+          <w:sz w:val="20"/>
+        </w:rPr>
+        <w:t>---------------+</w:t>
       </w:r>
     </w:p>
     <w:p>
@@ -4241,7 +4284,39 @@
           <w:rFonts w:ascii="Courier New" w:hAnsi="Courier New" w:cs="Courier New"/>
           <w:sz w:val="20"/>
         </w:rPr>
-        <w:t xml:space="preserve">   |  Studious Web  |   |   PostgreSQL   |</w:t>
+        <w:t xml:space="preserve">   </w:t>
+      </w:r>
+      <w:proofErr w:type="gramStart"/>
+      <w:r>
+        <w:rPr>
+          <w:rFonts w:ascii="Courier New" w:hAnsi="Courier New" w:cs="Courier New"/>
+          <w:sz w:val="20"/>
+        </w:rPr>
+        <w:t>|  Studious</w:t>
+      </w:r>
+      <w:proofErr w:type="gramEnd"/>
+      <w:r>
+        <w:rPr>
+          <w:rFonts w:ascii="Courier New" w:hAnsi="Courier New" w:cs="Courier New"/>
+          <w:sz w:val="20"/>
+        </w:rPr>
+        <w:t xml:space="preserve"> </w:t>
+      </w:r>
+      <w:proofErr w:type="gramStart"/>
+      <w:r>
+        <w:rPr>
+          <w:rFonts w:ascii="Courier New" w:hAnsi="Courier New" w:cs="Courier New"/>
+          <w:sz w:val="20"/>
+        </w:rPr>
+        <w:t>Web  |</w:t>
+      </w:r>
+      <w:proofErr w:type="gramEnd"/>
+      <w:r>
+        <w:rPr>
+          <w:rFonts w:ascii="Courier New" w:hAnsi="Courier New" w:cs="Courier New"/>
+          <w:sz w:val="20"/>
+        </w:rPr>
+        <w:t xml:space="preserve">   |   PostgreSQL   |</w:t>
       </w:r>
     </w:p>
     <w:p>
@@ -4275,7 +4350,23 @@
           <w:rFonts w:ascii="Courier New" w:hAnsi="Courier New" w:cs="Courier New"/>
           <w:sz w:val="20"/>
         </w:rPr>
-        <w:t xml:space="preserve">   |  Application   |&lt;-&gt;|   Database/API |</w:t>
+        <w:t xml:space="preserve">   </w:t>
+      </w:r>
+      <w:proofErr w:type="gramStart"/>
+      <w:r>
+        <w:rPr>
+          <w:rFonts w:ascii="Courier New" w:hAnsi="Courier New" w:cs="Courier New"/>
+          <w:sz w:val="20"/>
+        </w:rPr>
+        <w:t>|  Application</w:t>
+      </w:r>
+      <w:proofErr w:type="gramEnd"/>
+      <w:r>
+        <w:rPr>
+          <w:rFonts w:ascii="Courier New" w:hAnsi="Courier New" w:cs="Courier New"/>
+          <w:sz w:val="20"/>
+        </w:rPr>
+        <w:t xml:space="preserve">   |&lt;-&gt;|   Database/API |</w:t>
       </w:r>
     </w:p>
     <w:p>
@@ -4309,7 +4400,39 @@
           <w:rFonts w:ascii="Courier New" w:hAnsi="Courier New" w:cs="Courier New"/>
           <w:sz w:val="20"/>
         </w:rPr>
-        <w:t xml:space="preserve">   +----------------+   +----------------+</w:t>
+        <w:t xml:space="preserve">   </w:t>
+      </w:r>
+      <w:proofErr w:type="gramStart"/>
+      <w:r>
+        <w:rPr>
+          <w:rFonts w:ascii="Courier New" w:hAnsi="Courier New" w:cs="Courier New"/>
+          <w:sz w:val="20"/>
+        </w:rPr>
+        <w:t>+-</w:t>
+      </w:r>
+      <w:proofErr w:type="gramEnd"/>
+      <w:r>
+        <w:rPr>
+          <w:rFonts w:ascii="Courier New" w:hAnsi="Courier New" w:cs="Courier New"/>
+          <w:sz w:val="20"/>
+        </w:rPr>
+        <w:t xml:space="preserve">---------------+ </w:t>
+      </w:r>
+      <w:proofErr w:type="gramStart"/>
+      <w:r>
+        <w:rPr>
+          <w:rFonts w:ascii="Courier New" w:hAnsi="Courier New" w:cs="Courier New"/>
+          <w:sz w:val="20"/>
+        </w:rPr>
+        <w:t xml:space="preserve">  +-</w:t>
+      </w:r>
+      <w:proofErr w:type="gramEnd"/>
+      <w:r>
+        <w:rPr>
+          <w:rFonts w:ascii="Courier New" w:hAnsi="Courier New" w:cs="Courier New"/>
+          <w:sz w:val="20"/>
+        </w:rPr>
+        <w:t>---------------+</w:t>
       </w:r>
     </w:p>
     <w:p>
@@ -4326,7 +4449,7 @@
           <w:szCs w:val="24"/>
         </w:rPr>
         <w:pict w14:anchorId="0C1273C4">
-          <v:rect id="_x0000_i1151" style="width:0;height:1.5pt" o:hralign="center" o:hrstd="t" o:hr="t" fillcolor="#a0a0a0" stroked="f"/>
+          <v:rect id="_x0000_i1030" style="width:0;height:1.5pt" o:hralign="center" o:hrstd="t" o:hr="t" fillcolor="#a0a0a0" stroked="f"/>
         </w:pict>
       </w:r>
     </w:p>
@@ -4361,12 +4484,21 @@
           <w:szCs w:val="24"/>
         </w:rPr>
       </w:pPr>
-      <w:r>
-        <w:rPr>
-          <w:rFonts w:ascii="Times New Roman" w:hAnsi="Times New Roman"/>
-          <w:szCs w:val="24"/>
-        </w:rPr>
-        <w:t>Studious offers the following primary functions:</w:t>
+      <w:proofErr w:type="gramStart"/>
+      <w:r>
+        <w:rPr>
+          <w:rFonts w:ascii="Times New Roman" w:hAnsi="Times New Roman"/>
+          <w:szCs w:val="24"/>
+        </w:rPr>
+        <w:t>Studious</w:t>
+      </w:r>
+      <w:proofErr w:type="gramEnd"/>
+      <w:r>
+        <w:rPr>
+          <w:rFonts w:ascii="Times New Roman" w:hAnsi="Times New Roman"/>
+          <w:szCs w:val="24"/>
+        </w:rPr>
+        <w:t xml:space="preserve"> offers the following primary functions:</w:t>
       </w:r>
     </w:p>
     <w:p>
@@ -4818,7 +4950,7 @@
           <w:szCs w:val="24"/>
         </w:rPr>
         <w:pict w14:anchorId="3AEFCE24">
-          <v:rect id="_x0000_i1152" style="width:0;height:1.5pt" o:hralign="center" o:hrstd="t" o:hr="t" fillcolor="#a0a0a0" stroked="f"/>
+          <v:rect id="_x0000_i1031" style="width:0;height:1.5pt" o:hralign="center" o:hrstd="t" o:hr="t" fillcolor="#a0a0a0" stroked="f"/>
         </w:pict>
       </w:r>
     </w:p>
@@ -5308,7 +5440,7 @@
           <w:szCs w:val="24"/>
         </w:rPr>
         <w:pict w14:anchorId="1CC40DCD">
-          <v:rect id="_x0000_i1153" style="width:0;height:1.5pt" o:hralign="center" o:hrstd="t" o:hr="t" fillcolor="#a0a0a0" stroked="f"/>
+          <v:rect id="_x0000_i1032" style="width:0;height:1.5pt" o:hralign="center" o:hrstd="t" o:hr="t" fillcolor="#a0a0a0" stroked="f"/>
         </w:pict>
       </w:r>
     </w:p>
@@ -5343,12 +5475,21 @@
           <w:szCs w:val="24"/>
         </w:rPr>
       </w:pPr>
-      <w:r>
-        <w:rPr>
-          <w:rFonts w:ascii="Times New Roman" w:hAnsi="Times New Roman"/>
-          <w:szCs w:val="24"/>
-        </w:rPr>
-        <w:t>Studious will operate as a web-based platform accessible from most modern browsers and desktop systems.</w:t>
+      <w:proofErr w:type="gramStart"/>
+      <w:r>
+        <w:rPr>
+          <w:rFonts w:ascii="Times New Roman" w:hAnsi="Times New Roman"/>
+          <w:szCs w:val="24"/>
+        </w:rPr>
+        <w:t>Studious</w:t>
+      </w:r>
+      <w:proofErr w:type="gramEnd"/>
+      <w:r>
+        <w:rPr>
+          <w:rFonts w:ascii="Times New Roman" w:hAnsi="Times New Roman"/>
+          <w:szCs w:val="24"/>
+        </w:rPr>
+        <w:t xml:space="preserve"> will operate as a web-based platform accessible from most modern browsers and desktop systems.</w:t>
       </w:r>
     </w:p>
     <w:p>
@@ -5470,7 +5611,7 @@
           <w:szCs w:val="24"/>
         </w:rPr>
         <w:pict w14:anchorId="28523955">
-          <v:rect id="_x0000_i1154" style="width:0;height:1.5pt" o:hralign="center" o:hrstd="t" o:hr="t" fillcolor="#a0a0a0" stroked="f"/>
+          <v:rect id="_x0000_i1033" style="width:0;height:1.5pt" o:hralign="center" o:hrstd="t" o:hr="t" fillcolor="#a0a0a0" stroked="f"/>
         </w:pict>
       </w:r>
     </w:p>
@@ -5509,12 +5650,21 @@
           <w:szCs w:val="24"/>
         </w:rPr>
       </w:pPr>
-      <w:r>
-        <w:rPr>
-          <w:rFonts w:ascii="Times New Roman" w:hAnsi="Times New Roman"/>
-          <w:szCs w:val="24"/>
-        </w:rPr>
-        <w:t xml:space="preserve">Must be implemented using </w:t>
+      <w:proofErr w:type="gramStart"/>
+      <w:r>
+        <w:rPr>
+          <w:rFonts w:ascii="Times New Roman" w:hAnsi="Times New Roman"/>
+          <w:szCs w:val="24"/>
+        </w:rPr>
+        <w:t>Must</w:t>
+      </w:r>
+      <w:proofErr w:type="gramEnd"/>
+      <w:r>
+        <w:rPr>
+          <w:rFonts w:ascii="Times New Roman" w:hAnsi="Times New Roman"/>
+          <w:szCs w:val="24"/>
+        </w:rPr>
+        <w:t xml:space="preserve"> be implemented using </w:t>
       </w:r>
       <w:r>
         <w:rPr>
@@ -5717,12 +5867,21 @@
           <w:szCs w:val="24"/>
         </w:rPr>
       </w:pPr>
-      <w:r>
-        <w:rPr>
-          <w:rFonts w:ascii="Times New Roman" w:hAnsi="Times New Roman"/>
-          <w:szCs w:val="24"/>
-        </w:rPr>
-        <w:t xml:space="preserve">Must ensure page load and response times within </w:t>
+      <w:proofErr w:type="gramStart"/>
+      <w:r>
+        <w:rPr>
+          <w:rFonts w:ascii="Times New Roman" w:hAnsi="Times New Roman"/>
+          <w:szCs w:val="24"/>
+        </w:rPr>
+        <w:t>Must</w:t>
+      </w:r>
+      <w:proofErr w:type="gramEnd"/>
+      <w:r>
+        <w:rPr>
+          <w:rFonts w:ascii="Times New Roman" w:hAnsi="Times New Roman"/>
+          <w:szCs w:val="24"/>
+        </w:rPr>
+        <w:t xml:space="preserve"> ensure page load and response times within </w:t>
       </w:r>
       <w:r>
         <w:rPr>
@@ -5784,7 +5943,7 @@
           <w:szCs w:val="24"/>
         </w:rPr>
         <w:pict w14:anchorId="756E2CC5">
-          <v:rect id="_x0000_i1155" style="width:0;height:1.5pt" o:hralign="center" o:hrstd="t" o:hr="t" fillcolor="#a0a0a0" stroked="f"/>
+          <v:rect id="_x0000_i1034" style="width:0;height:1.5pt" o:hralign="center" o:hrstd="t" o:hr="t" fillcolor="#a0a0a0" stroked="f"/>
         </w:pict>
       </w:r>
     </w:p>
@@ -5968,7 +6127,7 @@
           <w:szCs w:val="24"/>
         </w:rPr>
         <w:pict w14:anchorId="1EB878EE">
-          <v:rect id="_x0000_i1156" style="width:0;height:1.5pt" o:hralign="center" o:hrstd="t" o:hr="t" fillcolor="#a0a0a0" stroked="f"/>
+          <v:rect id="_x0000_i1035" style="width:0;height:1.5pt" o:hralign="center" o:hrstd="t" o:hr="t" fillcolor="#a0a0a0" stroked="f"/>
         </w:pict>
       </w:r>
     </w:p>
@@ -6163,12 +6322,21 @@
           <w:szCs w:val="24"/>
         </w:rPr>
       </w:pPr>
-      <w:r>
-        <w:rPr>
-          <w:rFonts w:ascii="Times New Roman" w:hAnsi="Times New Roman"/>
-          <w:szCs w:val="24"/>
-        </w:rPr>
-        <w:t>Vercel (frontend) and Render (backend) for hosting and deployment.</w:t>
+      <w:proofErr w:type="spellStart"/>
+      <w:r>
+        <w:rPr>
+          <w:rFonts w:ascii="Times New Roman" w:hAnsi="Times New Roman"/>
+          <w:szCs w:val="24"/>
+        </w:rPr>
+        <w:t>Vercel</w:t>
+      </w:r>
+      <w:proofErr w:type="spellEnd"/>
+      <w:r>
+        <w:rPr>
+          <w:rFonts w:ascii="Times New Roman" w:hAnsi="Times New Roman"/>
+          <w:szCs w:val="24"/>
+        </w:rPr>
+        <w:t xml:space="preserve"> (frontend) and Render (backend) for hosting and deployment.</w:t>
       </w:r>
     </w:p>
     <w:p>
@@ -6203,7 +6371,15 @@
         <w:pStyle w:val="template"/>
       </w:pPr>
       <w:r>
-        <w:t>&lt;Describe the logical characteristics of each interface between the software product and the users. This may include sample screen images, any GUI standards or product family style guides that are to be followed, screen layout constraints, standard buttons and functions (e.g., help) that will appear on every screen, keyboard shortcuts, error message display standards, and so on. Define the software components for which a user interface is needed. Details of the user interface design should be documented in a separate user interface specification.&gt;</w:t>
+        <w:t xml:space="preserve">&lt;Describe the logical characteristics of each interface between the software product and the users. This may include sample screen images, </w:t>
+      </w:r>
+      <w:proofErr w:type="gramStart"/>
+      <w:r>
+        <w:t>any GUI</w:t>
+      </w:r>
+      <w:proofErr w:type="gramEnd"/>
+      <w:r>
+        <w:t xml:space="preserve"> standards or product family style guides that are to be followed, screen layout constraints, standard buttons and functions (e.g., help) that will appear on every screen, keyboard shortcuts, error message display standards, and so on. Define the software components for which a user interface is needed. Details of the user interface design should be documented in a separate user interface specification.&gt;</w:t>
       </w:r>
     </w:p>
     <w:p>
@@ -6236,11 +6412,19 @@
           <w:highlight w:val="yellow"/>
         </w:rPr>
       </w:pPr>
+      <w:proofErr w:type="gramStart"/>
       <w:r>
         <w:rPr>
           <w:highlight w:val="yellow"/>
         </w:rPr>
-        <w:t>all buttons will have a black border</w:t>
+        <w:t>all</w:t>
+      </w:r>
+      <w:proofErr w:type="gramEnd"/>
+      <w:r>
+        <w:rPr>
+          <w:highlight w:val="yellow"/>
+        </w:rPr>
+        <w:t xml:space="preserve"> buttons will have a black border</w:t>
       </w:r>
     </w:p>
     <w:p>
@@ -6254,11 +6438,19 @@
           <w:highlight w:val="yellow"/>
         </w:rPr>
       </w:pPr>
+      <w:proofErr w:type="gramStart"/>
       <w:r>
         <w:rPr>
           <w:highlight w:val="yellow"/>
         </w:rPr>
-        <w:t>all fonts will be Arial</w:t>
+        <w:t>all</w:t>
+      </w:r>
+      <w:proofErr w:type="gramEnd"/>
+      <w:r>
+        <w:rPr>
+          <w:highlight w:val="yellow"/>
+        </w:rPr>
+        <w:t xml:space="preserve"> fonts will be Arial</w:t>
       </w:r>
     </w:p>
     <w:p>
@@ -6327,11 +6519,19 @@
           <w:highlight w:val="yellow"/>
         </w:rPr>
       </w:pPr>
+      <w:proofErr w:type="spellStart"/>
       <w:r>
         <w:rPr>
           <w:highlight w:val="yellow"/>
         </w:rPr>
-        <w:t>etc…</w:t>
+        <w:t>etc</w:t>
+      </w:r>
+      <w:proofErr w:type="spellEnd"/>
+      <w:r>
+        <w:rPr>
+          <w:highlight w:val="yellow"/>
+        </w:rPr>
+        <w:t>…</w:t>
       </w:r>
     </w:p>
     <w:p>
@@ -6347,7 +6547,23 @@
         <w:pStyle w:val="template"/>
       </w:pPr>
       <w:r>
-        <w:t xml:space="preserve">As you develop this section you should continually message ideas to the discord. Make a few sketches and send them and see what we all agree on. The specifics like fonts, button borders, etc can be decided after we determine the general UI layout we all want. </w:t>
+        <w:t xml:space="preserve">As you develop this section you should continually message ideas to the discord. Make a few sketches and send them and see what we all agree on. The specifics like fonts, button borders, </w:t>
+      </w:r>
+      <w:proofErr w:type="spellStart"/>
+      <w:r>
+        <w:t>etc</w:t>
+      </w:r>
+      <w:proofErr w:type="spellEnd"/>
+      <w:r>
+        <w:t xml:space="preserve"> can be decided after we determine the general UI </w:t>
+      </w:r>
+      <w:proofErr w:type="gramStart"/>
+      <w:r>
+        <w:t>layout</w:t>
+      </w:r>
+      <w:proofErr w:type="gramEnd"/>
+      <w:r>
+        <w:t xml:space="preserve"> we all want. </w:t>
       </w:r>
     </w:p>
     <w:p>
@@ -6359,7 +6575,15 @@
         </w:numPr>
       </w:pPr>
       <w:r>
-        <w:t>We’ll try and support most screen resolutions but to be determined, look into how difficult that would be to implement</w:t>
+        <w:t xml:space="preserve">We’ll try and support most screen resolutions but to be determined, </w:t>
+      </w:r>
+      <w:proofErr w:type="gramStart"/>
+      <w:r>
+        <w:t>look into</w:t>
+      </w:r>
+      <w:proofErr w:type="gramEnd"/>
+      <w:r>
+        <w:t xml:space="preserve"> how difficult that would be to implement</w:t>
       </w:r>
     </w:p>
     <w:p>
@@ -6371,7 +6595,15 @@
         </w:numPr>
       </w:pPr>
       <w:r>
-        <w:t>Research Secton 508 and other standards and message group to see whether we should be compliant or not</w:t>
+        <w:t xml:space="preserve">Research </w:t>
+      </w:r>
+      <w:proofErr w:type="spellStart"/>
+      <w:r>
+        <w:t>Secton</w:t>
+      </w:r>
+      <w:proofErr w:type="spellEnd"/>
+      <w:r>
+        <w:t xml:space="preserve"> 508 and other standards and message group to see whether we should be compliant or not</w:t>
       </w:r>
     </w:p>
     <w:p>
@@ -6407,7 +6639,21 @@
         <w:rPr>
           <w:highlight w:val="yellow"/>
         </w:rPr>
-        <w:t>If you system doesn’t include hardware, then you’ll have none. If it has hardware components, then you should describe (at a high level) how you interface with that hardware.</w:t>
+        <w:t xml:space="preserve">If </w:t>
+      </w:r>
+      <w:proofErr w:type="gramStart"/>
+      <w:r>
+        <w:rPr>
+          <w:highlight w:val="yellow"/>
+        </w:rPr>
+        <w:t>you</w:t>
+      </w:r>
+      <w:proofErr w:type="gramEnd"/>
+      <w:r>
+        <w:rPr>
+          <w:highlight w:val="yellow"/>
+        </w:rPr>
+        <w:t xml:space="preserve"> system doesn’t include hardware, then you’ll have none. If it has hardware components, then you should describe (at a high level) how you interface with that hardware.</w:t>
       </w:r>
     </w:p>
     <w:p>
@@ -6456,7 +6702,35 @@
         <w:rPr>
           <w:highlight w:val="yellow"/>
         </w:rPr>
-        <w:t xml:space="preserve">These are internal connections to things like databases, web servers. You mainly need to explain that you have them, but (for COCS412) I don’t expect detailed information about how you actually connect to them and use them. Just explain that you </w:t>
+        <w:t xml:space="preserve">These are internal connections to things like </w:t>
+      </w:r>
+      <w:proofErr w:type="gramStart"/>
+      <w:r>
+        <w:rPr>
+          <w:highlight w:val="yellow"/>
+        </w:rPr>
+        <w:t>databases,</w:t>
+      </w:r>
+      <w:proofErr w:type="gramEnd"/>
+      <w:r>
+        <w:rPr>
+          <w:highlight w:val="yellow"/>
+        </w:rPr>
+        <w:t xml:space="preserve"> web servers. You mainly need to explain that you have them, but (for COCS412) I don’t expect detailed information about how you </w:t>
+      </w:r>
+      <w:proofErr w:type="gramStart"/>
+      <w:r>
+        <w:rPr>
+          <w:highlight w:val="yellow"/>
+        </w:rPr>
+        <w:t>actually connect</w:t>
+      </w:r>
+      <w:proofErr w:type="gramEnd"/>
+      <w:r>
+        <w:rPr>
+          <w:highlight w:val="yellow"/>
+        </w:rPr>
+        <w:t xml:space="preserve"> to them and use them. Just explain that you </w:t>
       </w:r>
       <w:r>
         <w:rPr>
@@ -6469,7 +6743,21 @@
         <w:rPr>
           <w:highlight w:val="yellow"/>
         </w:rPr>
-        <w:t xml:space="preserve"> connect to them and use them for storage of customer information, or to process incoming web requests, etc… These are internal components of your system.</w:t>
+        <w:t xml:space="preserve"> connect to them and use them for storage of customer information, or to process incoming web requests, </w:t>
+      </w:r>
+      <w:proofErr w:type="spellStart"/>
+      <w:r>
+        <w:rPr>
+          <w:highlight w:val="yellow"/>
+        </w:rPr>
+        <w:t>etc</w:t>
+      </w:r>
+      <w:proofErr w:type="spellEnd"/>
+      <w:r>
+        <w:rPr>
+          <w:highlight w:val="yellow"/>
+        </w:rPr>
+        <w:t>… These are internal components of your system.</w:t>
       </w:r>
     </w:p>
     <w:p>
@@ -6498,7 +6786,15 @@
         <w:t>Mention</w:t>
       </w:r>
       <w:r>
-        <w:t xml:space="preserve"> our databases, how we communicate with them (high level), how the users data will be sent from front end to back end, how it will </w:t>
+        <w:t xml:space="preserve"> our databases, how we communicate with them (high level), how the </w:t>
+      </w:r>
+      <w:proofErr w:type="gramStart"/>
+      <w:r>
+        <w:t>users</w:t>
+      </w:r>
+      <w:proofErr w:type="gramEnd"/>
+      <w:r>
+        <w:t xml:space="preserve"> data will be sent from front end to back end, how it will </w:t>
       </w:r>
       <w:r>
         <w:t>b</w:t>
@@ -6547,7 +6843,35 @@
         <w:rPr>
           <w:highlight w:val="yellow"/>
         </w:rPr>
-        <w:t>These are external communication mechanisms. Do you connect to a bank computer to verify credit card information? That is NOT part of your system, so it is an external communication you have. Describe it here. Do you have other systems connecting in to yours to perform some function? That would also go here.</w:t>
+        <w:t xml:space="preserve">These are external communication mechanisms. Do you connect to a bank computer to verify credit card information? That is NOT part of your system, so it is </w:t>
+      </w:r>
+      <w:proofErr w:type="gramStart"/>
+      <w:r>
+        <w:rPr>
+          <w:highlight w:val="yellow"/>
+        </w:rPr>
+        <w:t>an external</w:t>
+      </w:r>
+      <w:proofErr w:type="gramEnd"/>
+      <w:r>
+        <w:rPr>
+          <w:highlight w:val="yellow"/>
+        </w:rPr>
+        <w:t xml:space="preserve"> communication you have. Describe it here. Do you have other systems connecting </w:t>
+      </w:r>
+      <w:proofErr w:type="gramStart"/>
+      <w:r>
+        <w:rPr>
+          <w:highlight w:val="yellow"/>
+        </w:rPr>
+        <w:t>in to</w:t>
+      </w:r>
+      <w:proofErr w:type="gramEnd"/>
+      <w:r>
+        <w:rPr>
+          <w:highlight w:val="yellow"/>
+        </w:rPr>
+        <w:t xml:space="preserve"> yours to perform some function? That would also go here.</w:t>
       </w:r>
     </w:p>
     <w:p>
@@ -16118,7 +16442,15 @@
         <w:pStyle w:val="template"/>
       </w:pPr>
       <w:r>
-        <w:t>&lt;If there are performance requirements for the product under various circumstances, state them here and explain their rationale, to help the developers understand the intent and make suitable design choices. Specify the timing relationships for real time systems. Make such requirements as specific as possible. You may need to state performance requirements for individual functional requirements or features.&gt;</w:t>
+        <w:t xml:space="preserve">&lt;If there are performance requirements for the product under various circumstances, state them here and explain their rationale, to help the developers understand </w:t>
+      </w:r>
+      <w:proofErr w:type="gramStart"/>
+      <w:r>
+        <w:t>the</w:t>
+      </w:r>
+      <w:proofErr w:type="gramEnd"/>
+      <w:r>
+        <w:t xml:space="preserve"> intent and make suitable design choices. Specify the timing relationships for real time systems. Make such requirements as specific as possible. You may need to state performance requirements for individual functional requirements or features.&gt;</w:t>
       </w:r>
     </w:p>
     <w:p>
@@ -16131,15 +16463,28 @@
         <w:pStyle w:val="template"/>
       </w:pPr>
       <w:r>
-        <w:t>Only work when connected to wifi</w:t>
-      </w:r>
+        <w:t xml:space="preserve">Only work when connected to </w:t>
+      </w:r>
+      <w:proofErr w:type="spellStart"/>
+      <w:r>
+        <w:t>wifi</w:t>
+      </w:r>
+      <w:proofErr w:type="spellEnd"/>
     </w:p>
     <w:p>
       <w:pPr>
         <w:pStyle w:val="template"/>
       </w:pPr>
       <w:r>
-        <w:t>Think of more, communicate w team for help, possibly use chatgpt for ideas (make sure they are realistic and align with the project/other members work)</w:t>
+        <w:t xml:space="preserve">Think of more, communicate w team for help, possibly use </w:t>
+      </w:r>
+      <w:proofErr w:type="spellStart"/>
+      <w:r>
+        <w:t>chatgpt</w:t>
+      </w:r>
+      <w:proofErr w:type="spellEnd"/>
+      <w:r>
+        <w:t xml:space="preserve"> for ideas (make sure they are realistic and align with the project/other members work)</w:t>
       </w:r>
     </w:p>
     <w:p>
@@ -16424,15 +16769,24 @@
                 <w:rFonts w:ascii="Times New Roman" w:hAnsi="Times New Roman"/>
                 <w:sz w:val="20"/>
               </w:rPr>
-              <w:t>…….</w:t>
-            </w:r>
+              <w:t>…</w:t>
+            </w:r>
+            <w:proofErr w:type="gramStart"/>
             <w:r>
               <w:rPr>
                 <w:rFonts w:ascii="Times New Roman" w:hAnsi="Times New Roman"/>
                 <w:sz w:val="20"/>
               </w:rPr>
+              <w:t>….</w:t>
+            </w:r>
+            <w:r>
+              <w:rPr>
+                <w:rFonts w:ascii="Times New Roman" w:hAnsi="Times New Roman"/>
+                <w:sz w:val="20"/>
+              </w:rPr>
               <w:t>.</w:t>
             </w:r>
+            <w:proofErr w:type="gramEnd"/>
           </w:p>
         </w:tc>
         <w:tc>
@@ -16773,15 +17127,24 @@
                 <w:rFonts w:ascii="Times New Roman" w:hAnsi="Times New Roman"/>
                 <w:sz w:val="20"/>
               </w:rPr>
-              <w:t>…….</w:t>
-            </w:r>
+              <w:t>…</w:t>
+            </w:r>
+            <w:proofErr w:type="gramStart"/>
             <w:r>
               <w:rPr>
                 <w:rFonts w:ascii="Times New Roman" w:hAnsi="Times New Roman"/>
                 <w:sz w:val="20"/>
               </w:rPr>
+              <w:t>….</w:t>
+            </w:r>
+            <w:r>
+              <w:rPr>
+                <w:rFonts w:ascii="Times New Roman" w:hAnsi="Times New Roman"/>
+                <w:sz w:val="20"/>
+              </w:rPr>
               <w:t>.</w:t>
             </w:r>
+            <w:proofErr w:type="gramEnd"/>
           </w:p>
         </w:tc>
         <w:tc>
@@ -16873,15 +17236,25 @@
         <w:pStyle w:val="template"/>
       </w:pPr>
       <w:r>
-        <w:t>JSON Web tokens for authentiaiton</w:t>
-      </w:r>
+        <w:t xml:space="preserve">JSON Web tokens for </w:t>
+      </w:r>
+      <w:proofErr w:type="spellStart"/>
+      <w:r>
+        <w:t>authentiaiton</w:t>
+      </w:r>
+      <w:proofErr w:type="spellEnd"/>
     </w:p>
     <w:p>
       <w:pPr>
         <w:pStyle w:val="template"/>
       </w:pPr>
-      <w:r>
-        <w:t>Researfh external security policies</w:t>
+      <w:proofErr w:type="spellStart"/>
+      <w:r>
+        <w:t>Researfh</w:t>
+      </w:r>
+      <w:proofErr w:type="spellEnd"/>
+      <w:r>
+        <w:t xml:space="preserve"> external security policies</w:t>
       </w:r>
     </w:p>
     <w:p>
@@ -16889,7 +17262,15 @@
         <w:pStyle w:val="template"/>
       </w:pPr>
       <w:r>
-        <w:t>We want secure authentication</w:t>
+        <w:t xml:space="preserve">We want </w:t>
+      </w:r>
+      <w:proofErr w:type="gramStart"/>
+      <w:r>
+        <w:t>secure</w:t>
+      </w:r>
+      <w:proofErr w:type="gramEnd"/>
+      <w:r>
+        <w:t xml:space="preserve"> authentication</w:t>
       </w:r>
     </w:p>
     <w:p>
@@ -16905,8 +17286,21 @@
         <w:pStyle w:val="template"/>
       </w:pPr>
       <w:r>
-        <w:t>Find stuff that satifies above thigns</w:t>
-      </w:r>
+        <w:t xml:space="preserve">Find stuff that </w:t>
+      </w:r>
+      <w:proofErr w:type="spellStart"/>
+      <w:r>
+        <w:t>satifies</w:t>
+      </w:r>
+      <w:proofErr w:type="spellEnd"/>
+      <w:r>
+        <w:t xml:space="preserve"> above </w:t>
+      </w:r>
+      <w:proofErr w:type="spellStart"/>
+      <w:r>
+        <w:t>thigns</w:t>
+      </w:r>
+      <w:proofErr w:type="spellEnd"/>
     </w:p>
     <w:p>
       <w:pPr>
@@ -17190,15 +17584,24 @@
                 <w:rFonts w:ascii="Times New Roman" w:hAnsi="Times New Roman"/>
                 <w:sz w:val="20"/>
               </w:rPr>
-              <w:t>…….</w:t>
-            </w:r>
+              <w:t>…</w:t>
+            </w:r>
+            <w:proofErr w:type="gramStart"/>
             <w:r>
               <w:rPr>
                 <w:rFonts w:ascii="Times New Roman" w:hAnsi="Times New Roman"/>
                 <w:sz w:val="20"/>
               </w:rPr>
+              <w:t>….</w:t>
+            </w:r>
+            <w:r>
+              <w:rPr>
+                <w:rFonts w:ascii="Times New Roman" w:hAnsi="Times New Roman"/>
+                <w:sz w:val="20"/>
+              </w:rPr>
               <w:t>.</w:t>
             </w:r>
+            <w:proofErr w:type="gramEnd"/>
           </w:p>
         </w:tc>
         <w:tc>
@@ -17260,7 +17663,15 @@
         <w:pStyle w:val="template"/>
       </w:pPr>
       <w:r>
-        <w:t>&lt;Specify any additional quality characteristics for the product that will be important to either the customers or the developers. Some to consider are: adaptability, availability, correctness, flexibility, interoperability, maintainability, portability, reliability, reusability, robustness, testability, and usability. Write these to be specific, quantitative, and verifiable when possible. At the least, clarify the relative preferences for various attributes, such as ease of use over ease of learning.&gt;</w:t>
+        <w:t xml:space="preserve">&lt;Specify any additional quality characteristics for the product that will be important to either the customers or the developers. Some to consider </w:t>
+      </w:r>
+      <w:proofErr w:type="gramStart"/>
+      <w:r>
+        <w:t>are:</w:t>
+      </w:r>
+      <w:proofErr w:type="gramEnd"/>
+      <w:r>
+        <w:t xml:space="preserve"> adaptability, availability, correctness, flexibility, interoperability, maintainability, portability, reliability, reusability, robustness, testability, and usability. Write these to be specific, quantitative, and verifiable when possible. At the least, clarify the relative preferences for various attributes, such as ease of use over ease of learning.&gt;</w:t>
       </w:r>
     </w:p>
     <w:p>
@@ -17273,8 +17684,45 @@
         <w:pStyle w:val="template"/>
       </w:pPr>
       <w:r>
-        <w:t>Key ones are gonna be maintainability, testability, useability, scaleability, correctness, etc etc etc</w:t>
-      </w:r>
+        <w:t xml:space="preserve">Key ones are </w:t>
+      </w:r>
+      <w:proofErr w:type="spellStart"/>
+      <w:r>
+        <w:t>gonna</w:t>
+      </w:r>
+      <w:proofErr w:type="spellEnd"/>
+      <w:r>
+        <w:t xml:space="preserve"> be maintainability, testability, useability, </w:t>
+      </w:r>
+      <w:proofErr w:type="spellStart"/>
+      <w:r>
+        <w:t>scaleability</w:t>
+      </w:r>
+      <w:proofErr w:type="spellEnd"/>
+      <w:r>
+        <w:t xml:space="preserve">, correctness, </w:t>
+      </w:r>
+      <w:proofErr w:type="spellStart"/>
+      <w:r>
+        <w:t>etc</w:t>
+      </w:r>
+      <w:proofErr w:type="spellEnd"/>
+      <w:r>
+        <w:t xml:space="preserve"> </w:t>
+      </w:r>
+      <w:proofErr w:type="spellStart"/>
+      <w:r>
+        <w:t>etc</w:t>
+      </w:r>
+      <w:proofErr w:type="spellEnd"/>
+      <w:r>
+        <w:t xml:space="preserve"> </w:t>
+      </w:r>
+      <w:proofErr w:type="spellStart"/>
+      <w:r>
+        <w:t>etc</w:t>
+      </w:r>
+      <w:proofErr w:type="spellEnd"/>
     </w:p>
     <w:p>
       <w:pPr>
@@ -17552,15 +18000,24 @@
                 <w:rFonts w:ascii="Times New Roman" w:hAnsi="Times New Roman"/>
                 <w:sz w:val="20"/>
               </w:rPr>
-              <w:t>…….</w:t>
-            </w:r>
+              <w:t>…</w:t>
+            </w:r>
+            <w:proofErr w:type="gramStart"/>
             <w:r>
               <w:rPr>
                 <w:rFonts w:ascii="Times New Roman" w:hAnsi="Times New Roman"/>
                 <w:sz w:val="20"/>
               </w:rPr>
+              <w:t>….</w:t>
+            </w:r>
+            <w:r>
+              <w:rPr>
+                <w:rFonts w:ascii="Times New Roman" w:hAnsi="Times New Roman"/>
+                <w:sz w:val="20"/>
+              </w:rPr>
               <w:t>.</w:t>
             </w:r>
+            <w:proofErr w:type="gramEnd"/>
           </w:p>
         </w:tc>
         <w:tc>
@@ -17621,7 +18078,21 @@
         <w:rPr>
           <w:highlight w:val="yellow"/>
         </w:rPr>
-        <w:t>Add any and all of the non-functional requirements defined below, to ensure a complete set of technical and system requirements</w:t>
+        <w:t xml:space="preserve">Add </w:t>
+      </w:r>
+      <w:proofErr w:type="gramStart"/>
+      <w:r>
+        <w:rPr>
+          <w:highlight w:val="yellow"/>
+        </w:rPr>
+        <w:t>any and all</w:t>
+      </w:r>
+      <w:proofErr w:type="gramEnd"/>
+      <w:r>
+        <w:rPr>
+          <w:highlight w:val="yellow"/>
+        </w:rPr>
+        <w:t xml:space="preserve"> of the non-functional requirements defined below, to ensure a complete set of technical and system requirements</w:t>
       </w:r>
       <w:r>
         <w:rPr>
@@ -17956,8 +18427,21 @@
       <w:pPr>
         <w:pStyle w:val="template"/>
       </w:pPr>
-      <w:r>
-        <w:t>Resarch something that may be added here. Possibly work with persons 3 and 4 to figure out what requirements they DON’T have listed in their section</w:t>
+      <w:proofErr w:type="spellStart"/>
+      <w:r>
+        <w:t>Resarch</w:t>
+      </w:r>
+      <w:proofErr w:type="spellEnd"/>
+      <w:r>
+        <w:t xml:space="preserve"> something that may be added here. Possibly work with </w:t>
+      </w:r>
+      <w:proofErr w:type="gramStart"/>
+      <w:r>
+        <w:t>persons</w:t>
+      </w:r>
+      <w:proofErr w:type="gramEnd"/>
+      <w:r>
+        <w:t xml:space="preserve"> 3 and 4 to figure out what requirements they DON’T have listed in their section</w:t>
       </w:r>
     </w:p>
     <w:p>
@@ -18345,7 +18829,15 @@
                 <w:sz w:val="18"/>
                 <w:szCs w:val="18"/>
               </w:rPr>
-              <w:t>US#1</w:t>
+              <w:t>US#</w:t>
+            </w:r>
+            <w:r>
+              <w:rPr>
+                <w:rFonts w:ascii="Calibri" w:hAnsi="Calibri" w:cs="Calibri"/>
+                <w:sz w:val="18"/>
+                <w:szCs w:val="18"/>
+              </w:rPr>
+              <w:t>1</w:t>
             </w:r>
           </w:p>
         </w:tc>
@@ -18409,7 +18901,7 @@
                 <w:sz w:val="18"/>
                 <w:szCs w:val="18"/>
               </w:rPr>
-              <w:t>Property Manager</w:t>
+              <w:t>Student</w:t>
             </w:r>
           </w:p>
         </w:tc>
@@ -18465,13 +18957,23 @@
                 <w:szCs w:val="18"/>
               </w:rPr>
             </w:pPr>
+            <w:proofErr w:type="gramStart"/>
             <w:r>
               <w:rPr>
                 <w:rFonts w:ascii="Calibri" w:hAnsi="Calibri" w:cs="Calibri"/>
                 <w:sz w:val="18"/>
                 <w:szCs w:val="18"/>
               </w:rPr>
-              <w:t>provide a map-based UI containing all relevant property management data layers that can be interacted with to obtain property details</w:t>
+              <w:t>Provide</w:t>
+            </w:r>
+            <w:proofErr w:type="gramEnd"/>
+            <w:r>
+              <w:rPr>
+                <w:rFonts w:ascii="Calibri" w:hAnsi="Calibri" w:cs="Calibri"/>
+                <w:sz w:val="18"/>
+                <w:szCs w:val="18"/>
+              </w:rPr>
+              <w:t xml:space="preserve"> a way for users to upload information about their current coursework, grade level, and attending school</w:t>
             </w:r>
           </w:p>
         </w:tc>
@@ -18533,7 +19035,7 @@
                 <w:sz w:val="18"/>
                 <w:szCs w:val="18"/>
               </w:rPr>
-              <w:t>have a centralized application for obtaining property information in a geographic context, to use as the launch point for various property management workflows.</w:t>
+              <w:t>Connect with my peers that are taking similar courses, in the same grade, or in the same school as collaborating with these peers would be the most beneficial.</w:t>
             </w:r>
           </w:p>
         </w:tc>
@@ -18634,6 +19136,14 @@
                 <w:szCs w:val="18"/>
               </w:rPr>
             </w:pPr>
+            <w:r>
+              <w:rPr>
+                <w:rFonts w:ascii="Calibri" w:hAnsi="Calibri" w:cs="Calibri"/>
+                <w:sz w:val="18"/>
+                <w:szCs w:val="18"/>
+              </w:rPr>
+              <w:t>Student</w:t>
+            </w:r>
           </w:p>
         </w:tc>
         <w:tc>
@@ -18688,6 +19198,14 @@
                 <w:szCs w:val="18"/>
               </w:rPr>
             </w:pPr>
+            <w:r>
+              <w:rPr>
+                <w:rFonts w:ascii="Calibri" w:hAnsi="Calibri" w:cs="Calibri"/>
+                <w:sz w:val="18"/>
+                <w:szCs w:val="18"/>
+              </w:rPr>
+              <w:t>Support sharing text, images, and files within direct messaging and within study circles</w:t>
+            </w:r>
           </w:p>
         </w:tc>
         <w:tc>
@@ -18742,6 +19260,14 @@
                 <w:szCs w:val="18"/>
               </w:rPr>
             </w:pPr>
+            <w:r>
+              <w:rPr>
+                <w:rFonts w:ascii="Calibri" w:hAnsi="Calibri" w:cs="Calibri"/>
+                <w:sz w:val="18"/>
+                <w:szCs w:val="18"/>
+              </w:rPr>
+              <w:t>Share notes, assignments, and collaborate more effectively with my peers</w:t>
+            </w:r>
           </w:p>
         </w:tc>
       </w:tr>
@@ -18841,6 +19367,14 @@
                 <w:szCs w:val="18"/>
               </w:rPr>
             </w:pPr>
+            <w:r>
+              <w:rPr>
+                <w:rFonts w:ascii="Calibri" w:hAnsi="Calibri" w:cs="Calibri"/>
+                <w:sz w:val="18"/>
+                <w:szCs w:val="18"/>
+              </w:rPr>
+              <w:t>Student</w:t>
+            </w:r>
           </w:p>
         </w:tc>
         <w:tc>
@@ -18895,6 +19429,14 @@
                 <w:szCs w:val="18"/>
               </w:rPr>
             </w:pPr>
+            <w:r>
+              <w:rPr>
+                <w:rFonts w:ascii="Calibri" w:hAnsi="Calibri" w:cs="Calibri"/>
+                <w:sz w:val="18"/>
+                <w:szCs w:val="18"/>
+              </w:rPr>
+              <w:t xml:space="preserve">Support messaging through both direct messaging as well as study circles </w:t>
+            </w:r>
           </w:p>
         </w:tc>
         <w:tc>
@@ -18949,6 +19491,14 @@
                 <w:szCs w:val="18"/>
               </w:rPr>
             </w:pPr>
+            <w:r>
+              <w:rPr>
+                <w:rFonts w:ascii="Calibri" w:hAnsi="Calibri" w:cs="Calibri"/>
+                <w:sz w:val="18"/>
+                <w:szCs w:val="18"/>
+              </w:rPr>
+              <w:t>Collaborate with my peers over a service that is specifically designed to support learning and education</w:t>
+            </w:r>
           </w:p>
         </w:tc>
       </w:tr>
@@ -18976,22 +19526,6 @@
                 <w:szCs w:val="18"/>
               </w:rPr>
             </w:pPr>
-            <w:r>
-              <w:rPr>
-                <w:rFonts w:ascii="Calibri" w:hAnsi="Calibri" w:cs="Calibri"/>
-                <w:sz w:val="18"/>
-                <w:szCs w:val="18"/>
-              </w:rPr>
-              <w:t>US#</w:t>
-            </w:r>
-            <w:r>
-              <w:rPr>
-                <w:rFonts w:ascii="Calibri" w:hAnsi="Calibri" w:cs="Calibri"/>
-                <w:sz w:val="18"/>
-                <w:szCs w:val="18"/>
-              </w:rPr>
-              <w:t>4</w:t>
-            </w:r>
           </w:p>
         </w:tc>
         <w:tc>
@@ -19016,14 +19550,6 @@
                 <w:szCs w:val="18"/>
               </w:rPr>
             </w:pPr>
-            <w:r>
-              <w:rPr>
-                <w:rFonts w:ascii="Calibri" w:hAnsi="Calibri" w:cs="Calibri"/>
-                <w:sz w:val="18"/>
-                <w:szCs w:val="18"/>
-              </w:rPr>
-              <w:t>As a</w:t>
-            </w:r>
           </w:p>
         </w:tc>
         <w:tc>
@@ -19072,14 +19598,6 @@
                 <w:szCs w:val="18"/>
               </w:rPr>
             </w:pPr>
-            <w:r>
-              <w:rPr>
-                <w:rFonts w:ascii="Calibri" w:hAnsi="Calibri" w:cs="Calibri"/>
-                <w:sz w:val="18"/>
-                <w:szCs w:val="18"/>
-              </w:rPr>
-              <w:t>I need the system to</w:t>
-            </w:r>
           </w:p>
         </w:tc>
         <w:tc>
@@ -19126,14 +19644,6 @@
                 <w:szCs w:val="18"/>
               </w:rPr>
             </w:pPr>
-            <w:r>
-              <w:rPr>
-                <w:rFonts w:ascii="Calibri" w:hAnsi="Calibri" w:cs="Calibri"/>
-                <w:sz w:val="18"/>
-                <w:szCs w:val="18"/>
-              </w:rPr>
-              <w:t>so that I may</w:t>
-            </w:r>
           </w:p>
         </w:tc>
         <w:tc>
@@ -19188,7 +19698,15 @@
         <w:pStyle w:val="template"/>
       </w:pPr>
       <w:r>
-        <w:t>&lt;Define all the terms necessary to properly interpret the SRS, including acronyms and abbreviations. You may wish to build a separate glossary that spans multiple projects or the entire organization, and just include terms specific to a single project in each SRS.&gt;</w:t>
+        <w:t xml:space="preserve">&lt;Define all the terms necessary to properly interpret the SRS, including acronyms and abbreviations. You may wish to build a separate glossary that spans multiple projects or the entire </w:t>
+      </w:r>
+      <w:proofErr w:type="gramStart"/>
+      <w:r>
+        <w:t>organization, and</w:t>
+      </w:r>
+      <w:proofErr w:type="gramEnd"/>
+      <w:r>
+        <w:t xml:space="preserve"> just include terms specific to a single project in each SRS.&gt;</w:t>
       </w:r>
     </w:p>
     <w:p>
@@ -19252,7 +19770,21 @@
         <w:rPr>
           <w:highlight w:val="yellow"/>
         </w:rPr>
-        <w:t>List here any open questions or things you know still need to be done to the SRS, but haven’t been addressed yet.</w:t>
+        <w:t xml:space="preserve">List here any open questions or things you know still need to be done to the </w:t>
+      </w:r>
+      <w:proofErr w:type="gramStart"/>
+      <w:r>
+        <w:rPr>
+          <w:highlight w:val="yellow"/>
+        </w:rPr>
+        <w:t>SRS, but</w:t>
+      </w:r>
+      <w:proofErr w:type="gramEnd"/>
+      <w:r>
+        <w:rPr>
+          <w:highlight w:val="yellow"/>
+        </w:rPr>
+        <w:t xml:space="preserve"> haven’t been addressed yet.</w:t>
       </w:r>
       <w:r>
         <w:t xml:space="preserve"> </w:t>
@@ -19267,8 +19799,29 @@
       <w:pPr>
         <w:pStyle w:val="template"/>
       </w:pPr>
-      <w:r>
-        <w:t xml:space="preserve">Not sure what tbd means if that means documents or features or idk. Researfh the correct answer. </w:t>
+      <w:proofErr w:type="gramStart"/>
+      <w:r>
+        <w:t>Not</w:t>
+      </w:r>
+      <w:proofErr w:type="gramEnd"/>
+      <w:r>
+        <w:t xml:space="preserve"> sure what </w:t>
+      </w:r>
+      <w:proofErr w:type="spellStart"/>
+      <w:r>
+        <w:t>tbd</w:t>
+      </w:r>
+      <w:proofErr w:type="spellEnd"/>
+      <w:r>
+        <w:t xml:space="preserve"> means if that means documents or features or idk. </w:t>
+      </w:r>
+      <w:proofErr w:type="spellStart"/>
+      <w:r>
+        <w:t>Researfh</w:t>
+      </w:r>
+      <w:proofErr w:type="spellEnd"/>
+      <w:r>
+        <w:t xml:space="preserve"> the correct answer. </w:t>
       </w:r>
     </w:p>
     <w:sectPr>

</xml_diff>

<commit_message>
added back some requirement statemetns that were previously cut
</commit_message>
<xml_diff>
--- a/ASGMNT3/JHET_Innovations-Assignment3-SRS.docx
+++ b/ASGMNT3/JHET_Innovations-Assignment3-SRS.docx
@@ -3535,6 +3535,13 @@
               </w:rPr>
               <w:t>Added sections 1 and 2</w:t>
             </w:r>
+            <w:r>
+              <w:rPr>
+                <w:rFonts w:ascii="Times New Roman" w:hAnsi="Times New Roman"/>
+                <w:sz w:val="20"/>
+              </w:rPr>
+              <w:t xml:space="preserve"> from Eddie</w:t>
+            </w:r>
           </w:p>
         </w:tc>
         <w:tc>
@@ -3705,6 +3712,31 @@
               </w:rPr>
               <w:t>Removed unneeded information</w:t>
             </w:r>
+          </w:p>
+          <w:p>
+            <w:pPr>
+              <w:spacing w:line="276" w:lineRule="auto"/>
+              <w:rPr>
+                <w:rFonts w:ascii="Times New Roman" w:hAnsi="Times New Roman"/>
+                <w:sz w:val="20"/>
+              </w:rPr>
+            </w:pPr>
+            <w:r>
+              <w:rPr>
+                <w:rFonts w:ascii="Times New Roman" w:hAnsi="Times New Roman"/>
+                <w:sz w:val="20"/>
+              </w:rPr>
+              <w:t xml:space="preserve">Added Sections 3 and 6 from </w:t>
+            </w:r>
+            <w:proofErr w:type="spellStart"/>
+            <w:r>
+              <w:rPr>
+                <w:rFonts w:ascii="Times New Roman" w:hAnsi="Times New Roman"/>
+                <w:sz w:val="20"/>
+              </w:rPr>
+              <w:t>Tehrence</w:t>
+            </w:r>
+            <w:proofErr w:type="spellEnd"/>
           </w:p>
         </w:tc>
         <w:tc>
@@ -9620,6 +9652,162 @@
                 <w:sz w:val="20"/>
               </w:rPr>
               <w:t>H</w:t>
+            </w:r>
+          </w:p>
+        </w:tc>
+      </w:tr>
+      <w:tr>
+        <w:trPr>
+          <w:tblCellSpacing w:w="0" w:type="dxa"/>
+        </w:trPr>
+        <w:tc>
+          <w:tcPr>
+            <w:tcW w:w="907" w:type="dxa"/>
+            <w:tcBorders>
+              <w:top w:val="outset" w:sz="6" w:space="0" w:color="auto"/>
+              <w:left w:val="outset" w:sz="6" w:space="0" w:color="auto"/>
+              <w:bottom w:val="outset" w:sz="6" w:space="0" w:color="auto"/>
+              <w:right w:val="outset" w:sz="6" w:space="0" w:color="auto"/>
+            </w:tcBorders>
+            <w:tcMar>
+              <w:top w:w="15" w:type="dxa"/>
+              <w:left w:w="15" w:type="dxa"/>
+              <w:bottom w:w="15" w:type="dxa"/>
+              <w:right w:w="15" w:type="dxa"/>
+            </w:tcMar>
+          </w:tcPr>
+          <w:p>
+            <w:pPr>
+              <w:spacing w:line="276" w:lineRule="auto"/>
+              <w:rPr>
+                <w:rFonts w:ascii="Times New Roman" w:hAnsi="Times New Roman"/>
+                <w:sz w:val="20"/>
+              </w:rPr>
+            </w:pPr>
+            <w:r>
+              <w:rPr>
+                <w:rFonts w:ascii="Times New Roman" w:hAnsi="Times New Roman"/>
+                <w:sz w:val="20"/>
+              </w:rPr>
+              <w:t>EIR#1.8</w:t>
+            </w:r>
+          </w:p>
+        </w:tc>
+        <w:tc>
+          <w:tcPr>
+            <w:tcW w:w="1483" w:type="dxa"/>
+            <w:tcBorders>
+              <w:top w:val="outset" w:sz="6" w:space="0" w:color="auto"/>
+              <w:left w:val="outset" w:sz="6" w:space="0" w:color="auto"/>
+              <w:bottom w:val="outset" w:sz="6" w:space="0" w:color="auto"/>
+              <w:right w:val="outset" w:sz="6" w:space="0" w:color="auto"/>
+            </w:tcBorders>
+            <w:tcMar>
+              <w:top w:w="15" w:type="dxa"/>
+              <w:left w:w="15" w:type="dxa"/>
+              <w:bottom w:w="15" w:type="dxa"/>
+              <w:right w:w="15" w:type="dxa"/>
+            </w:tcMar>
+          </w:tcPr>
+          <w:p>
+            <w:pPr>
+              <w:spacing w:line="276" w:lineRule="auto"/>
+              <w:jc w:val="center"/>
+              <w:rPr>
+                <w:rFonts w:ascii="Times New Roman" w:hAnsi="Times New Roman"/>
+                <w:sz w:val="20"/>
+              </w:rPr>
+            </w:pPr>
+            <w:r>
+              <w:rPr>
+                <w:rFonts w:ascii="Times New Roman" w:hAnsi="Times New Roman"/>
+                <w:sz w:val="20"/>
+              </w:rPr>
+              <w:t>User</w:t>
+            </w:r>
+          </w:p>
+          <w:p>
+            <w:pPr>
+              <w:spacing w:line="276" w:lineRule="auto"/>
+              <w:jc w:val="center"/>
+              <w:rPr>
+                <w:rFonts w:ascii="Times New Roman" w:hAnsi="Times New Roman"/>
+                <w:sz w:val="20"/>
+              </w:rPr>
+            </w:pPr>
+            <w:r>
+              <w:rPr>
+                <w:rFonts w:ascii="Times New Roman" w:hAnsi="Times New Roman"/>
+                <w:sz w:val="20"/>
+              </w:rPr>
+              <w:t>Interface</w:t>
+            </w:r>
+          </w:p>
+        </w:tc>
+        <w:tc>
+          <w:tcPr>
+            <w:tcW w:w="6382" w:type="dxa"/>
+            <w:tcBorders>
+              <w:top w:val="outset" w:sz="6" w:space="0" w:color="auto"/>
+              <w:left w:val="outset" w:sz="6" w:space="0" w:color="auto"/>
+              <w:bottom w:val="outset" w:sz="6" w:space="0" w:color="auto"/>
+              <w:right w:val="outset" w:sz="6" w:space="0" w:color="auto"/>
+            </w:tcBorders>
+            <w:tcMar>
+              <w:top w:w="15" w:type="dxa"/>
+              <w:left w:w="15" w:type="dxa"/>
+              <w:bottom w:w="15" w:type="dxa"/>
+              <w:right w:w="15" w:type="dxa"/>
+            </w:tcMar>
+          </w:tcPr>
+          <w:p>
+            <w:pPr>
+              <w:spacing w:line="276" w:lineRule="auto"/>
+              <w:rPr>
+                <w:rFonts w:ascii="Times New Roman" w:hAnsi="Times New Roman"/>
+                <w:sz w:val="20"/>
+              </w:rPr>
+            </w:pPr>
+            <w:r>
+              <w:rPr>
+                <w:rFonts w:ascii="Times New Roman" w:hAnsi="Times New Roman"/>
+                <w:sz w:val="20"/>
+              </w:rPr>
+              <w:t>The system will meet accessibility standards aligned with WCAG 2.1 AA guidelines.</w:t>
+            </w:r>
+          </w:p>
+        </w:tc>
+        <w:tc>
+          <w:tcPr>
+            <w:tcW w:w="936" w:type="dxa"/>
+            <w:tcBorders>
+              <w:top w:val="outset" w:sz="6" w:space="0" w:color="auto"/>
+              <w:left w:val="outset" w:sz="6" w:space="0" w:color="auto"/>
+              <w:bottom w:val="outset" w:sz="6" w:space="0" w:color="auto"/>
+              <w:right w:val="outset" w:sz="6" w:space="0" w:color="auto"/>
+            </w:tcBorders>
+            <w:tcMar>
+              <w:top w:w="15" w:type="dxa"/>
+              <w:left w:w="15" w:type="dxa"/>
+              <w:bottom w:w="15" w:type="dxa"/>
+              <w:right w:w="15" w:type="dxa"/>
+            </w:tcMar>
+          </w:tcPr>
+          <w:p>
+            <w:pPr>
+              <w:spacing w:line="276" w:lineRule="auto"/>
+              <w:jc w:val="center"/>
+              <w:rPr>
+                <w:rFonts w:ascii="Times New Roman" w:hAnsi="Times New Roman"/>
+                <w:sz w:val="20"/>
+              </w:rPr>
+            </w:pPr>
+            <w:r>
+              <w:rPr>
+                <w:rFonts w:ascii="Times New Roman" w:hAnsi="Times New Roman"/>
+                <w:sz w:val="20"/>
+              </w:rPr>
+              <w:t>M</w:t>
             </w:r>
           </w:p>
         </w:tc>
@@ -10730,6 +10918,7 @@
                 <w:bCs/>
                 <w:sz w:val="20"/>
               </w:rPr>
+              <w:lastRenderedPageBreak/>
               <w:t>EIR#3.0</w:t>
             </w:r>
           </w:p>
@@ -10894,7 +11083,6 @@
                 <w:rFonts w:ascii="Times New Roman" w:hAnsi="Times New Roman"/>
                 <w:sz w:val="20"/>
               </w:rPr>
-              <w:lastRenderedPageBreak/>
               <w:t>EIR#</w:t>
             </w:r>
             <w:r>
@@ -11325,6 +11513,162 @@
                 <w:sz w:val="20"/>
               </w:rPr>
               <w:t>L</w:t>
+            </w:r>
+          </w:p>
+        </w:tc>
+      </w:tr>
+      <w:tr>
+        <w:trPr>
+          <w:tblCellSpacing w:w="0" w:type="dxa"/>
+        </w:trPr>
+        <w:tc>
+          <w:tcPr>
+            <w:tcW w:w="907" w:type="dxa"/>
+            <w:tcBorders>
+              <w:top w:val="outset" w:sz="6" w:space="0" w:color="auto"/>
+              <w:left w:val="outset" w:sz="6" w:space="0" w:color="auto"/>
+              <w:bottom w:val="outset" w:sz="6" w:space="0" w:color="auto"/>
+              <w:right w:val="outset" w:sz="6" w:space="0" w:color="auto"/>
+            </w:tcBorders>
+            <w:tcMar>
+              <w:top w:w="15" w:type="dxa"/>
+              <w:left w:w="15" w:type="dxa"/>
+              <w:bottom w:w="15" w:type="dxa"/>
+              <w:right w:w="15" w:type="dxa"/>
+            </w:tcMar>
+          </w:tcPr>
+          <w:p>
+            <w:pPr>
+              <w:spacing w:line="276" w:lineRule="auto"/>
+              <w:rPr>
+                <w:rFonts w:ascii="Times New Roman" w:hAnsi="Times New Roman"/>
+                <w:sz w:val="20"/>
+              </w:rPr>
+            </w:pPr>
+            <w:r>
+              <w:rPr>
+                <w:rFonts w:ascii="Times New Roman" w:hAnsi="Times New Roman"/>
+                <w:sz w:val="20"/>
+              </w:rPr>
+              <w:t>EIR#3.3</w:t>
+            </w:r>
+          </w:p>
+        </w:tc>
+        <w:tc>
+          <w:tcPr>
+            <w:tcW w:w="1483" w:type="dxa"/>
+            <w:tcBorders>
+              <w:top w:val="outset" w:sz="6" w:space="0" w:color="auto"/>
+              <w:left w:val="outset" w:sz="6" w:space="0" w:color="auto"/>
+              <w:bottom w:val="outset" w:sz="6" w:space="0" w:color="auto"/>
+              <w:right w:val="outset" w:sz="6" w:space="0" w:color="auto"/>
+            </w:tcBorders>
+            <w:tcMar>
+              <w:top w:w="15" w:type="dxa"/>
+              <w:left w:w="15" w:type="dxa"/>
+              <w:bottom w:w="15" w:type="dxa"/>
+              <w:right w:w="15" w:type="dxa"/>
+            </w:tcMar>
+          </w:tcPr>
+          <w:p>
+            <w:pPr>
+              <w:spacing w:line="276" w:lineRule="auto"/>
+              <w:jc w:val="center"/>
+              <w:rPr>
+                <w:rFonts w:ascii="Times New Roman" w:hAnsi="Times New Roman"/>
+                <w:sz w:val="20"/>
+              </w:rPr>
+            </w:pPr>
+            <w:r>
+              <w:rPr>
+                <w:rFonts w:ascii="Times New Roman" w:hAnsi="Times New Roman"/>
+                <w:sz w:val="20"/>
+              </w:rPr>
+              <w:t>Software</w:t>
+            </w:r>
+          </w:p>
+          <w:p>
+            <w:pPr>
+              <w:spacing w:line="276" w:lineRule="auto"/>
+              <w:jc w:val="center"/>
+              <w:rPr>
+                <w:rFonts w:ascii="Times New Roman" w:hAnsi="Times New Roman"/>
+                <w:sz w:val="20"/>
+              </w:rPr>
+            </w:pPr>
+            <w:r>
+              <w:rPr>
+                <w:rFonts w:ascii="Times New Roman" w:hAnsi="Times New Roman"/>
+                <w:sz w:val="20"/>
+              </w:rPr>
+              <w:t>Requirements</w:t>
+            </w:r>
+          </w:p>
+        </w:tc>
+        <w:tc>
+          <w:tcPr>
+            <w:tcW w:w="6382" w:type="dxa"/>
+            <w:tcBorders>
+              <w:top w:val="outset" w:sz="6" w:space="0" w:color="auto"/>
+              <w:left w:val="outset" w:sz="6" w:space="0" w:color="auto"/>
+              <w:bottom w:val="outset" w:sz="6" w:space="0" w:color="auto"/>
+              <w:right w:val="outset" w:sz="6" w:space="0" w:color="auto"/>
+            </w:tcBorders>
+            <w:tcMar>
+              <w:top w:w="15" w:type="dxa"/>
+              <w:left w:w="15" w:type="dxa"/>
+              <w:bottom w:w="15" w:type="dxa"/>
+              <w:right w:w="15" w:type="dxa"/>
+            </w:tcMar>
+          </w:tcPr>
+          <w:p>
+            <w:pPr>
+              <w:spacing w:line="276" w:lineRule="auto"/>
+              <w:rPr>
+                <w:rFonts w:ascii="Times New Roman" w:hAnsi="Times New Roman"/>
+                <w:sz w:val="20"/>
+              </w:rPr>
+            </w:pPr>
+            <w:r>
+              <w:rPr>
+                <w:rFonts w:ascii="Times New Roman" w:hAnsi="Times New Roman"/>
+                <w:sz w:val="20"/>
+              </w:rPr>
+              <w:t>The system will support file uploads and downloads through cloud storage (e.g., AWS S3 or Google Drive integration).</w:t>
+            </w:r>
+          </w:p>
+        </w:tc>
+        <w:tc>
+          <w:tcPr>
+            <w:tcW w:w="936" w:type="dxa"/>
+            <w:tcBorders>
+              <w:top w:val="outset" w:sz="6" w:space="0" w:color="auto"/>
+              <w:left w:val="outset" w:sz="6" w:space="0" w:color="auto"/>
+              <w:bottom w:val="outset" w:sz="6" w:space="0" w:color="auto"/>
+              <w:right w:val="outset" w:sz="6" w:space="0" w:color="auto"/>
+            </w:tcBorders>
+            <w:tcMar>
+              <w:top w:w="15" w:type="dxa"/>
+              <w:left w:w="15" w:type="dxa"/>
+              <w:bottom w:w="15" w:type="dxa"/>
+              <w:right w:w="15" w:type="dxa"/>
+            </w:tcMar>
+          </w:tcPr>
+          <w:p>
+            <w:pPr>
+              <w:spacing w:line="276" w:lineRule="auto"/>
+              <w:jc w:val="center"/>
+              <w:rPr>
+                <w:rFonts w:ascii="Times New Roman" w:hAnsi="Times New Roman"/>
+                <w:sz w:val="20"/>
+              </w:rPr>
+            </w:pPr>
+            <w:r>
+              <w:rPr>
+                <w:rFonts w:ascii="Times New Roman" w:hAnsi="Times New Roman"/>
+                <w:sz w:val="20"/>
+              </w:rPr>
+              <w:t>M</w:t>
             </w:r>
           </w:p>
         </w:tc>
@@ -13333,6 +13677,7 @@
                 <w:rFonts w:ascii="Times New Roman" w:hAnsi="Times New Roman"/>
                 <w:sz w:val="20"/>
               </w:rPr>
+              <w:lastRenderedPageBreak/>
               <w:t>FR#1.</w:t>
             </w:r>
             <w:r>
@@ -13577,7 +13922,6 @@
                 <w:rFonts w:ascii="Times New Roman" w:hAnsi="Times New Roman"/>
                 <w:sz w:val="20"/>
               </w:rPr>
-              <w:lastRenderedPageBreak/>
               <w:t>FR#1.</w:t>
             </w:r>
             <w:r>
@@ -16356,6 +16700,7 @@
                 <w:rFonts w:ascii="Times New Roman" w:hAnsi="Times New Roman"/>
                 <w:sz w:val="20"/>
               </w:rPr>
+              <w:lastRenderedPageBreak/>
               <w:t>FR#4.</w:t>
             </w:r>
             <w:r>
@@ -16625,7 +16970,6 @@
                 <w:rFonts w:ascii="Times New Roman" w:hAnsi="Times New Roman"/>
                 <w:sz w:val="20"/>
               </w:rPr>
-              <w:lastRenderedPageBreak/>
               <w:t>FR#4.3</w:t>
             </w:r>
           </w:p>
@@ -19149,6 +19493,7 @@
                 <w:iCs/>
                 <w:sz w:val="20"/>
               </w:rPr>
+              <w:lastRenderedPageBreak/>
               <w:t>Category Header</w:t>
             </w:r>
           </w:p>
@@ -19413,7 +19758,6 @@
                 <w:rFonts w:ascii="Times New Roman" w:hAnsi="Times New Roman"/>
                 <w:sz w:val="20"/>
               </w:rPr>
-              <w:lastRenderedPageBreak/>
               <w:t>The system must securely store user passwords as encrypted hashes.</w:t>
             </w:r>
           </w:p>
@@ -22098,6 +22442,7 @@
           <w:rFonts w:ascii="Times New Roman" w:hAnsi="Times New Roman"/>
           <w:sz w:val="20"/>
         </w:rPr>
+        <w:lastRenderedPageBreak/>
         <w:pict w14:anchorId="38180FA0">
           <v:rect id="_x0000_i1041" style="width:0;height:1.5pt" o:hrstd="t" o:hr="t" fillcolor="#a0a0a0" stroked="f"/>
         </w:pict>
@@ -22137,7 +22482,6 @@
           <w:rFonts w:ascii="Times New Roman" w:hAnsi="Times New Roman"/>
           <w:szCs w:val="36"/>
         </w:rPr>
-        <w:lastRenderedPageBreak/>
         <w:t xml:space="preserve">5. </w:t>
       </w:r>
       <w:r>
@@ -23339,6 +23683,7 @@
           <w:rFonts w:ascii="Times New Roman" w:hAnsi="Times New Roman"/>
           <w:sz w:val="20"/>
         </w:rPr>
+        <w:lastRenderedPageBreak/>
         <w:t xml:space="preserve">Find stuff that </w:t>
       </w:r>
       <w:proofErr w:type="spellStart"/>
@@ -23432,7 +23777,6 @@
                 <w:bCs/>
                 <w:sz w:val="20"/>
               </w:rPr>
-              <w:lastRenderedPageBreak/>
               <w:t xml:space="preserve">Req #  </w:t>
             </w:r>
           </w:p>
@@ -24803,6 +25147,7 @@
                 <w:bCs/>
                 <w:sz w:val="20"/>
               </w:rPr>
+              <w:lastRenderedPageBreak/>
               <w:t xml:space="preserve">Req #  </w:t>
             </w:r>
           </w:p>
@@ -24987,7 +25332,6 @@
                 <w:bCs/>
                 <w:sz w:val="20"/>
               </w:rPr>
-              <w:lastRenderedPageBreak/>
               <w:t>OR#1.0</w:t>
             </w:r>
           </w:p>
@@ -27109,173 +27453,6 @@
               </w:rPr>
               <w:t>L</w:t>
             </w:r>
-          </w:p>
-        </w:tc>
-      </w:tr>
-      <w:tr>
-        <w:trPr>
-          <w:tblCellSpacing w:w="0" w:type="dxa"/>
-        </w:trPr>
-        <w:tc>
-          <w:tcPr>
-            <w:tcW w:w="710" w:type="dxa"/>
-            <w:tcBorders>
-              <w:top w:val="outset" w:sz="6" w:space="0" w:color="auto"/>
-              <w:left w:val="outset" w:sz="6" w:space="0" w:color="auto"/>
-              <w:bottom w:val="outset" w:sz="6" w:space="0" w:color="auto"/>
-              <w:right w:val="outset" w:sz="6" w:space="0" w:color="auto"/>
-            </w:tcBorders>
-            <w:tcMar>
-              <w:top w:w="15" w:type="dxa"/>
-              <w:left w:w="15" w:type="dxa"/>
-              <w:bottom w:w="15" w:type="dxa"/>
-              <w:right w:w="15" w:type="dxa"/>
-            </w:tcMar>
-          </w:tcPr>
-          <w:p>
-            <w:pPr>
-              <w:rPr>
-                <w:sz w:val="20"/>
-              </w:rPr>
-            </w:pPr>
-            <w:r>
-              <w:rPr>
-                <w:sz w:val="20"/>
-              </w:rPr>
-              <w:t>OR#</w:t>
-            </w:r>
-            <w:r>
-              <w:rPr>
-                <w:sz w:val="20"/>
-              </w:rPr>
-              <w:t>4</w:t>
-            </w:r>
-            <w:r>
-              <w:rPr>
-                <w:sz w:val="20"/>
-              </w:rPr>
-              <w:t>.4</w:t>
-            </w:r>
-          </w:p>
-        </w:tc>
-        <w:tc>
-          <w:tcPr>
-            <w:tcW w:w="1478" w:type="dxa"/>
-            <w:tcBorders>
-              <w:top w:val="outset" w:sz="6" w:space="0" w:color="auto"/>
-              <w:left w:val="outset" w:sz="6" w:space="0" w:color="auto"/>
-              <w:bottom w:val="outset" w:sz="6" w:space="0" w:color="auto"/>
-              <w:right w:val="outset" w:sz="6" w:space="0" w:color="auto"/>
-            </w:tcBorders>
-            <w:tcMar>
-              <w:top w:w="15" w:type="dxa"/>
-              <w:left w:w="15" w:type="dxa"/>
-              <w:bottom w:w="15" w:type="dxa"/>
-              <w:right w:w="15" w:type="dxa"/>
-            </w:tcMar>
-          </w:tcPr>
-          <w:p>
-            <w:pPr>
-              <w:jc w:val="center"/>
-              <w:rPr>
-                <w:sz w:val="20"/>
-              </w:rPr>
-            </w:pPr>
-            <w:r>
-              <w:rPr>
-                <w:sz w:val="20"/>
-              </w:rPr>
-              <w:t>Accessibility</w:t>
-            </w:r>
-          </w:p>
-          <w:p>
-            <w:pPr>
-              <w:jc w:val="center"/>
-              <w:rPr>
-                <w:sz w:val="20"/>
-              </w:rPr>
-            </w:pPr>
-          </w:p>
-        </w:tc>
-        <w:tc>
-          <w:tcPr>
-            <w:tcW w:w="6582" w:type="dxa"/>
-            <w:tcBorders>
-              <w:top w:val="outset" w:sz="6" w:space="0" w:color="auto"/>
-              <w:left w:val="outset" w:sz="6" w:space="0" w:color="auto"/>
-              <w:bottom w:val="outset" w:sz="6" w:space="0" w:color="auto"/>
-              <w:right w:val="outset" w:sz="6" w:space="0" w:color="auto"/>
-            </w:tcBorders>
-            <w:tcMar>
-              <w:top w:w="15" w:type="dxa"/>
-              <w:left w:w="15" w:type="dxa"/>
-              <w:bottom w:w="15" w:type="dxa"/>
-              <w:right w:w="15" w:type="dxa"/>
-            </w:tcMar>
-          </w:tcPr>
-          <w:p>
-            <w:pPr>
-              <w:rPr>
-                <w:sz w:val="20"/>
-              </w:rPr>
-            </w:pPr>
-            <w:r>
-              <w:rPr>
-                <w:sz w:val="20"/>
-              </w:rPr>
-              <w:t xml:space="preserve">The system’s UI </w:t>
-            </w:r>
-            <w:r>
-              <w:rPr>
-                <w:sz w:val="20"/>
-              </w:rPr>
-              <w:t>must</w:t>
-            </w:r>
-            <w:r>
-              <w:rPr>
-                <w:sz w:val="20"/>
-              </w:rPr>
-              <w:t xml:space="preserve"> meet accessibility standards aligned with WCAG 2.1 AA guidelines.</w:t>
-            </w:r>
-          </w:p>
-        </w:tc>
-        <w:tc>
-          <w:tcPr>
-            <w:tcW w:w="938" w:type="dxa"/>
-            <w:tcBorders>
-              <w:top w:val="outset" w:sz="6" w:space="0" w:color="auto"/>
-              <w:left w:val="outset" w:sz="6" w:space="0" w:color="auto"/>
-              <w:bottom w:val="outset" w:sz="6" w:space="0" w:color="auto"/>
-              <w:right w:val="outset" w:sz="6" w:space="0" w:color="auto"/>
-            </w:tcBorders>
-            <w:tcMar>
-              <w:top w:w="15" w:type="dxa"/>
-              <w:left w:w="15" w:type="dxa"/>
-              <w:bottom w:w="15" w:type="dxa"/>
-              <w:right w:w="15" w:type="dxa"/>
-            </w:tcMar>
-          </w:tcPr>
-          <w:p>
-            <w:pPr>
-              <w:jc w:val="center"/>
-              <w:rPr>
-                <w:sz w:val="20"/>
-              </w:rPr>
-            </w:pPr>
-            <w:r>
-              <w:rPr>
-                <w:sz w:val="20"/>
-              </w:rPr>
-              <w:t>M</w:t>
-            </w:r>
-          </w:p>
-          <w:p>
-            <w:pPr>
-              <w:jc w:val="center"/>
-              <w:rPr>
-                <w:sz w:val="20"/>
-              </w:rPr>
-            </w:pPr>
           </w:p>
         </w:tc>
       </w:tr>

</xml_diff>

<commit_message>
Added slides for functional requirements, added theme for powerpoint, Minor edits to SRS document
</commit_message>
<xml_diff>
--- a/ASGMNT3/JHET_Innovations-Assignment3-SRS.docx
+++ b/ASGMNT3/JHET_Innovations-Assignment3-SRS.docx
@@ -19379,16 +19379,6 @@
               <w:t>Security</w:t>
             </w:r>
           </w:p>
-          <w:p>
-            <w:pPr>
-              <w:spacing w:line="276" w:lineRule="auto"/>
-              <w:jc w:val="center"/>
-              <w:rPr>
-                <w:rFonts w:ascii="Times New Roman" w:hAnsi="Times New Roman"/>
-                <w:sz w:val="20"/>
-              </w:rPr>
-            </w:pPr>
-          </w:p>
         </w:tc>
         <w:tc>
           <w:tcPr>
@@ -19413,7 +19403,6 @@
                 <w:rFonts w:ascii="Times New Roman" w:hAnsi="Times New Roman"/>
                 <w:sz w:val="20"/>
               </w:rPr>
-              <w:lastRenderedPageBreak/>
               <w:t>The system must securely store user passwords as encrypted hashes.</w:t>
             </w:r>
           </w:p>
@@ -19474,6 +19463,7 @@
                 <w:rFonts w:ascii="Times New Roman" w:hAnsi="Times New Roman"/>
                 <w:sz w:val="20"/>
               </w:rPr>
+              <w:lastRenderedPageBreak/>
               <w:t>FR#7.</w:t>
             </w:r>
             <w:r>
@@ -32548,6 +32538,7 @@
   <w:style w:type="character" w:default="1" w:styleId="DefaultParagraphFont">
     <w:name w:val="Default Paragraph Font"/>
     <w:uiPriority w:val="1"/>
+    <w:semiHidden/>
     <w:unhideWhenUsed/>
   </w:style>
   <w:style w:type="table" w:default="1" w:styleId="TableNormal">

</xml_diff>

<commit_message>
Fixed formatting issues in the SRS document and made slight adjustments to task 3 slides in the ppt
</commit_message>
<xml_diff>
--- a/ASGMNT3/JHET_Innovations-Assignment3-SRS.docx
+++ b/ASGMNT3/JHET_Innovations-Assignment3-SRS.docx
@@ -9654,17 +9654,47 @@
       <w:r>
         <w:rPr>
           <w:rFonts w:ascii="Times New Roman" w:hAnsi="Times New Roman"/>
+          <w:sz w:val="20"/>
+        </w:rPr>
+        <w:t>Below is a</w:t>
+      </w:r>
+      <w:r>
+        <w:rPr>
+          <w:rFonts w:ascii="Times New Roman" w:hAnsi="Times New Roman"/>
+          <w:sz w:val="20"/>
+        </w:rPr>
+        <w:t>n</w:t>
+      </w:r>
+      <w:r>
+        <w:rPr>
+          <w:rFonts w:ascii="Times New Roman" w:hAnsi="Times New Roman"/>
+          <w:sz w:val="20"/>
+        </w:rPr>
+        <w:t xml:space="preserve"> AI generated sketch of the general layout we plan to implement.</w:t>
+      </w:r>
+    </w:p>
+    <w:p>
+      <w:pPr>
+        <w:spacing w:line="276" w:lineRule="auto"/>
+        <w:rPr>
+          <w:rFonts w:ascii="Times New Roman" w:hAnsi="Times New Roman"/>
+          <w:sz w:val="20"/>
+        </w:rPr>
+      </w:pPr>
+      <w:r>
+        <w:rPr>
+          <w:rFonts w:ascii="Times New Roman" w:hAnsi="Times New Roman"/>
           <w:noProof/>
           <w:sz w:val="20"/>
         </w:rPr>
         <w:drawing>
-          <wp:anchor distT="0" distB="0" distL="114300" distR="114300" simplePos="0" relativeHeight="251659264" behindDoc="0" locked="0" layoutInCell="1" allowOverlap="1" wp14:anchorId="7CCD0C7B" wp14:editId="29BC5723">
+          <wp:anchor distT="0" distB="0" distL="114300" distR="114300" simplePos="0" relativeHeight="251659264" behindDoc="0" locked="0" layoutInCell="1" allowOverlap="1" wp14:anchorId="7CCD0C7B" wp14:editId="1B67ECDC">
             <wp:simplePos x="0" y="0"/>
             <wp:positionH relativeFrom="margin">
               <wp:align>center</wp:align>
             </wp:positionH>
             <wp:positionV relativeFrom="margin">
-              <wp:posOffset>280347</wp:posOffset>
+              <wp:posOffset>1472178</wp:posOffset>
             </wp:positionV>
             <wp:extent cx="4602480" cy="3068320"/>
             <wp:effectExtent l="0" t="0" r="7620" b="0"/>
@@ -9717,36 +9747,6 @@
           </wp:anchor>
         </w:drawing>
       </w:r>
-      <w:r>
-        <w:rPr>
-          <w:rFonts w:ascii="Times New Roman" w:hAnsi="Times New Roman"/>
-          <w:sz w:val="20"/>
-        </w:rPr>
-        <w:t>Below is a</w:t>
-      </w:r>
-      <w:r>
-        <w:rPr>
-          <w:rFonts w:ascii="Times New Roman" w:hAnsi="Times New Roman"/>
-          <w:sz w:val="20"/>
-        </w:rPr>
-        <w:t>n</w:t>
-      </w:r>
-      <w:r>
-        <w:rPr>
-          <w:rFonts w:ascii="Times New Roman" w:hAnsi="Times New Roman"/>
-          <w:sz w:val="20"/>
-        </w:rPr>
-        <w:t xml:space="preserve"> AI generated sketch of the general layout we plan to implement.</w:t>
-      </w:r>
-    </w:p>
-    <w:p>
-      <w:pPr>
-        <w:spacing w:line="276" w:lineRule="auto"/>
-        <w:rPr>
-          <w:rFonts w:ascii="Times New Roman" w:hAnsi="Times New Roman"/>
-          <w:sz w:val="20"/>
-        </w:rPr>
-      </w:pPr>
     </w:p>
     <w:p>
       <w:pPr>

</xml_diff>

<commit_message>
started filling out contribution summary, reordered powerpoint for clarity
</commit_message>
<xml_diff>
--- a/ASGMNT3/JHET_Innovations-Assignment3-SRS.docx
+++ b/ASGMNT3/JHET_Innovations-Assignment3-SRS.docx
@@ -493,7 +493,6 @@
         <w:spacing w:before="0" w:line="276" w:lineRule="auto"/>
         <w:rPr>
           <w:rFonts w:ascii="Times New Roman" w:hAnsi="Times New Roman"/>
-          <w:b w:val="0"/>
           <w:sz w:val="22"/>
           <w:szCs w:val="22"/>
         </w:rPr>
@@ -551,7 +550,7 @@
           <w:sz w:val="22"/>
           <w:szCs w:val="22"/>
         </w:rPr>
-        <w:t>ii</w:t>
+        <w:t>i</w:t>
       </w:r>
       <w:r>
         <w:rPr>
@@ -559,7 +558,121 @@
           <w:sz w:val="22"/>
           <w:szCs w:val="22"/>
         </w:rPr>
+        <w:t>i</w:t>
+      </w:r>
+      <w:r>
+        <w:rPr>
+          <w:rFonts w:ascii="Times New Roman" w:hAnsi="Times New Roman"/>
+          <w:sz w:val="22"/>
+          <w:szCs w:val="22"/>
+        </w:rPr>
+        <w:t>i</w:t>
+      </w:r>
+      <w:r>
+        <w:rPr>
+          <w:rFonts w:ascii="Times New Roman" w:hAnsi="Times New Roman"/>
+          <w:sz w:val="22"/>
+          <w:szCs w:val="22"/>
+        </w:rPr>
         <w:fldChar w:fldCharType="end"/>
+      </w:r>
+    </w:p>
+    <w:p>
+      <w:pPr>
+        <w:pStyle w:val="TOC1"/>
+        <w:spacing w:before="0" w:line="276" w:lineRule="auto"/>
+        <w:rPr>
+          <w:rFonts w:ascii="Times New Roman" w:hAnsi="Times New Roman"/>
+          <w:sz w:val="22"/>
+          <w:szCs w:val="22"/>
+        </w:rPr>
+      </w:pPr>
+      <w:r>
+        <w:rPr>
+          <w:rFonts w:ascii="Times New Roman" w:hAnsi="Times New Roman"/>
+          <w:sz w:val="22"/>
+          <w:szCs w:val="22"/>
+        </w:rPr>
+        <w:t>Contribution Summary</w:t>
+      </w:r>
+      <w:r>
+        <w:rPr>
+          <w:rFonts w:ascii="Times New Roman" w:hAnsi="Times New Roman"/>
+          <w:sz w:val="22"/>
+          <w:szCs w:val="22"/>
+        </w:rPr>
+        <w:tab/>
+      </w:r>
+      <w:r>
+        <w:rPr>
+          <w:rFonts w:ascii="Times New Roman" w:hAnsi="Times New Roman"/>
+          <w:sz w:val="22"/>
+          <w:szCs w:val="22"/>
+        </w:rPr>
+        <w:fldChar w:fldCharType="begin"/>
+      </w:r>
+      <w:r>
+        <w:rPr>
+          <w:rFonts w:ascii="Times New Roman" w:hAnsi="Times New Roman"/>
+          <w:sz w:val="22"/>
+          <w:szCs w:val="22"/>
+        </w:rPr>
+        <w:instrText xml:space="preserve"> PAGEREF _Toc93232697 \h </w:instrText>
+      </w:r>
+      <w:r>
+        <w:rPr>
+          <w:rFonts w:ascii="Times New Roman" w:hAnsi="Times New Roman"/>
+          <w:sz w:val="22"/>
+          <w:szCs w:val="22"/>
+        </w:rPr>
+      </w:r>
+      <w:r>
+        <w:rPr>
+          <w:rFonts w:ascii="Times New Roman" w:hAnsi="Times New Roman"/>
+          <w:sz w:val="22"/>
+          <w:szCs w:val="22"/>
+        </w:rPr>
+        <w:fldChar w:fldCharType="separate"/>
+      </w:r>
+      <w:r>
+        <w:rPr>
+          <w:rFonts w:ascii="Times New Roman" w:hAnsi="Times New Roman"/>
+          <w:sz w:val="22"/>
+          <w:szCs w:val="22"/>
+        </w:rPr>
+        <w:t>i</w:t>
+      </w:r>
+      <w:r>
+        <w:rPr>
+          <w:rFonts w:ascii="Times New Roman" w:hAnsi="Times New Roman"/>
+          <w:sz w:val="22"/>
+          <w:szCs w:val="22"/>
+        </w:rPr>
+        <w:t>i</w:t>
+      </w:r>
+      <w:r>
+        <w:rPr>
+          <w:rFonts w:ascii="Times New Roman" w:hAnsi="Times New Roman"/>
+          <w:sz w:val="22"/>
+          <w:szCs w:val="22"/>
+        </w:rPr>
+        <w:t>i</w:t>
+      </w:r>
+      <w:r>
+        <w:rPr>
+          <w:rFonts w:ascii="Times New Roman" w:hAnsi="Times New Roman"/>
+          <w:sz w:val="22"/>
+          <w:szCs w:val="22"/>
+        </w:rPr>
+        <w:fldChar w:fldCharType="end"/>
+      </w:r>
+      <w:r>
+        <w:rPr>
+          <w:rFonts w:ascii="Times New Roman" w:hAnsi="Times New Roman"/>
+          <w:sz w:val="22"/>
+          <w:szCs w:val="22"/>
+        </w:rPr>
+        <w:t>i</w:t>
       </w:r>
     </w:p>
     <w:p>
@@ -4014,6 +4127,226 @@
         <w:spacing w:before="0" w:after="0" w:line="276" w:lineRule="auto"/>
         <w:rPr>
           <w:rFonts w:ascii="Times New Roman" w:hAnsi="Times New Roman"/>
+          <w:sz w:val="20"/>
+        </w:rPr>
+      </w:pPr>
+    </w:p>
+    <w:p>
+      <w:pPr>
+        <w:pStyle w:val="TOCEntry"/>
+        <w:spacing w:before="0" w:after="0" w:line="276" w:lineRule="auto"/>
+        <w:rPr>
+          <w:rFonts w:ascii="Times New Roman" w:hAnsi="Times New Roman"/>
+          <w:sz w:val="20"/>
+        </w:rPr>
+      </w:pPr>
+    </w:p>
+    <w:p>
+      <w:pPr>
+        <w:pStyle w:val="TOCEntry"/>
+        <w:spacing w:before="0" w:after="0" w:line="276" w:lineRule="auto"/>
+        <w:rPr>
+          <w:rFonts w:ascii="Times New Roman" w:hAnsi="Times New Roman"/>
+          <w:sz w:val="20"/>
+        </w:rPr>
+      </w:pPr>
+    </w:p>
+    <w:p>
+      <w:pPr>
+        <w:pStyle w:val="TOCEntry"/>
+        <w:spacing w:before="0" w:after="0" w:line="276" w:lineRule="auto"/>
+        <w:rPr>
+          <w:rFonts w:ascii="Times New Roman" w:hAnsi="Times New Roman"/>
+          <w:sz w:val="20"/>
+        </w:rPr>
+      </w:pPr>
+    </w:p>
+    <w:p>
+      <w:pPr>
+        <w:spacing w:line="276" w:lineRule="auto"/>
+        <w:rPr>
+          <w:rFonts w:ascii="Times New Roman" w:hAnsi="Times New Roman"/>
+          <w:sz w:val="20"/>
+        </w:rPr>
+      </w:pPr>
+    </w:p>
+    <w:p>
+      <w:pPr>
+        <w:spacing w:line="276" w:lineRule="auto"/>
+        <w:rPr>
+          <w:rFonts w:ascii="Times New Roman" w:hAnsi="Times New Roman"/>
+          <w:sz w:val="20"/>
+        </w:rPr>
+      </w:pPr>
+    </w:p>
+    <w:p>
+      <w:pPr>
+        <w:spacing w:line="276" w:lineRule="auto"/>
+        <w:rPr>
+          <w:rFonts w:ascii="Times New Roman" w:hAnsi="Times New Roman"/>
+          <w:sz w:val="20"/>
+        </w:rPr>
+      </w:pPr>
+    </w:p>
+    <w:p>
+      <w:pPr>
+        <w:spacing w:line="276" w:lineRule="auto"/>
+        <w:rPr>
+          <w:rFonts w:ascii="Times New Roman" w:hAnsi="Times New Roman"/>
+          <w:sz w:val="20"/>
+        </w:rPr>
+      </w:pPr>
+    </w:p>
+    <w:p>
+      <w:pPr>
+        <w:spacing w:line="276" w:lineRule="auto"/>
+        <w:rPr>
+          <w:rFonts w:ascii="Times New Roman" w:hAnsi="Times New Roman"/>
+          <w:sz w:val="20"/>
+        </w:rPr>
+      </w:pPr>
+    </w:p>
+    <w:p>
+      <w:pPr>
+        <w:spacing w:line="276" w:lineRule="auto"/>
+        <w:rPr>
+          <w:rFonts w:ascii="Times New Roman" w:hAnsi="Times New Roman"/>
+          <w:sz w:val="20"/>
+        </w:rPr>
+      </w:pPr>
+    </w:p>
+    <w:p>
+      <w:pPr>
+        <w:spacing w:line="276" w:lineRule="auto"/>
+        <w:rPr>
+          <w:rFonts w:ascii="Times New Roman" w:hAnsi="Times New Roman"/>
+          <w:sz w:val="20"/>
+        </w:rPr>
+      </w:pPr>
+    </w:p>
+    <w:p>
+      <w:pPr>
+        <w:spacing w:line="276" w:lineRule="auto"/>
+        <w:rPr>
+          <w:rFonts w:ascii="Times New Roman" w:hAnsi="Times New Roman"/>
+          <w:sz w:val="20"/>
+        </w:rPr>
+      </w:pPr>
+    </w:p>
+    <w:p>
+      <w:pPr>
+        <w:spacing w:line="276" w:lineRule="auto"/>
+        <w:rPr>
+          <w:rFonts w:ascii="Times New Roman" w:hAnsi="Times New Roman"/>
+          <w:sz w:val="20"/>
+        </w:rPr>
+      </w:pPr>
+    </w:p>
+    <w:p>
+      <w:pPr>
+        <w:spacing w:line="276" w:lineRule="auto"/>
+        <w:rPr>
+          <w:rFonts w:ascii="Times New Roman" w:hAnsi="Times New Roman"/>
+          <w:sz w:val="20"/>
+        </w:rPr>
+      </w:pPr>
+    </w:p>
+    <w:p>
+      <w:pPr>
+        <w:spacing w:line="276" w:lineRule="auto"/>
+        <w:rPr>
+          <w:rFonts w:ascii="Times New Roman" w:hAnsi="Times New Roman"/>
+          <w:sz w:val="20"/>
+        </w:rPr>
+      </w:pPr>
+    </w:p>
+    <w:p>
+      <w:pPr>
+        <w:spacing w:line="276" w:lineRule="auto"/>
+        <w:rPr>
+          <w:rFonts w:ascii="Times New Roman" w:hAnsi="Times New Roman"/>
+          <w:sz w:val="20"/>
+        </w:rPr>
+      </w:pPr>
+    </w:p>
+    <w:p>
+      <w:pPr>
+        <w:spacing w:line="276" w:lineRule="auto"/>
+        <w:rPr>
+          <w:rFonts w:ascii="Times New Roman" w:hAnsi="Times New Roman"/>
+          <w:sz w:val="20"/>
+        </w:rPr>
+      </w:pPr>
+    </w:p>
+    <w:p>
+      <w:pPr>
+        <w:spacing w:line="276" w:lineRule="auto"/>
+        <w:rPr>
+          <w:rFonts w:ascii="Times New Roman" w:hAnsi="Times New Roman"/>
+          <w:sz w:val="20"/>
+        </w:rPr>
+      </w:pPr>
+    </w:p>
+    <w:p>
+      <w:pPr>
+        <w:spacing w:line="276" w:lineRule="auto"/>
+        <w:rPr>
+          <w:rFonts w:ascii="Times New Roman" w:hAnsi="Times New Roman"/>
+          <w:sz w:val="20"/>
+        </w:rPr>
+      </w:pPr>
+    </w:p>
+    <w:p>
+      <w:pPr>
+        <w:spacing w:line="276" w:lineRule="auto"/>
+        <w:rPr>
+          <w:rFonts w:ascii="Times New Roman" w:hAnsi="Times New Roman"/>
+          <w:sz w:val="20"/>
+        </w:rPr>
+      </w:pPr>
+    </w:p>
+    <w:p>
+      <w:pPr>
+        <w:spacing w:line="276" w:lineRule="auto"/>
+        <w:rPr>
+          <w:rFonts w:ascii="Times New Roman" w:hAnsi="Times New Roman"/>
+          <w:sz w:val="20"/>
+        </w:rPr>
+      </w:pPr>
+    </w:p>
+    <w:p>
+      <w:pPr>
+        <w:spacing w:line="276" w:lineRule="auto"/>
+        <w:rPr>
+          <w:rFonts w:ascii="Times New Roman" w:hAnsi="Times New Roman"/>
+          <w:sz w:val="20"/>
+        </w:rPr>
+      </w:pPr>
+    </w:p>
+    <w:p>
+      <w:pPr>
+        <w:spacing w:line="276" w:lineRule="auto"/>
+        <w:rPr>
+          <w:rFonts w:ascii="Times New Roman" w:hAnsi="Times New Roman"/>
+          <w:sz w:val="20"/>
+        </w:rPr>
+      </w:pPr>
+    </w:p>
+    <w:p>
+      <w:pPr>
+        <w:spacing w:line="276" w:lineRule="auto"/>
+        <w:rPr>
+          <w:rFonts w:ascii="Times New Roman" w:hAnsi="Times New Roman"/>
+          <w:sz w:val="20"/>
+        </w:rPr>
+      </w:pPr>
+    </w:p>
+    <w:p>
+      <w:pPr>
+        <w:pStyle w:val="TOCEntry"/>
+        <w:spacing w:before="0" w:after="0" w:line="276" w:lineRule="auto"/>
+        <w:rPr>
+          <w:rFonts w:ascii="Times New Roman" w:hAnsi="Times New Roman"/>
           <w:szCs w:val="36"/>
         </w:rPr>
       </w:pPr>
@@ -4022,7 +4355,54 @@
           <w:rFonts w:ascii="Times New Roman" w:hAnsi="Times New Roman"/>
           <w:szCs w:val="36"/>
         </w:rPr>
+        <w:lastRenderedPageBreak/>
+        <w:t xml:space="preserve">SRS </w:t>
+      </w:r>
+      <w:r>
+        <w:rPr>
+          <w:rFonts w:ascii="Times New Roman" w:hAnsi="Times New Roman"/>
+          <w:szCs w:val="36"/>
+        </w:rPr>
+        <w:t>Document</w:t>
+      </w:r>
+      <w:r>
+        <w:rPr>
+          <w:rFonts w:ascii="Times New Roman" w:hAnsi="Times New Roman"/>
+          <w:szCs w:val="36"/>
+        </w:rPr>
+        <w:t xml:space="preserve"> </w:t>
+      </w:r>
+      <w:r>
+        <w:rPr>
+          <w:rFonts w:ascii="Times New Roman" w:hAnsi="Times New Roman"/>
+          <w:szCs w:val="36"/>
+        </w:rPr>
         <w:t>Contribution Summary</w:t>
+      </w:r>
+    </w:p>
+    <w:p>
+      <w:pPr>
+        <w:pStyle w:val="TOCEntry"/>
+        <w:spacing w:before="0" w:after="0" w:line="276" w:lineRule="auto"/>
+        <w:rPr>
+          <w:rFonts w:ascii="Times New Roman" w:hAnsi="Times New Roman"/>
+          <w:b w:val="0"/>
+          <w:bCs/>
+          <w:i/>
+          <w:iCs/>
+          <w:sz w:val="20"/>
+        </w:rPr>
+      </w:pPr>
+      <w:r>
+        <w:rPr>
+          <w:rFonts w:ascii="Times New Roman" w:hAnsi="Times New Roman"/>
+          <w:b w:val="0"/>
+          <w:bCs/>
+          <w:i/>
+          <w:iCs/>
+          <w:sz w:val="20"/>
+        </w:rPr>
+        <w:t>Completed refers to work done nearly or entirely solo. Contributed refers to work done as partners or a team</w:t>
       </w:r>
     </w:p>
     <w:tbl>
@@ -4097,7 +4477,7 @@
                 <w:b/>
                 <w:sz w:val="20"/>
               </w:rPr>
-              <w:t>Version</w:t>
+              <w:t>Contributions</w:t>
             </w:r>
           </w:p>
         </w:tc>
@@ -4139,6 +4519,95 @@
           </w:tcPr>
           <w:p>
             <w:pPr>
+              <w:pStyle w:val="ListParagraph"/>
+              <w:numPr>
+                <w:ilvl w:val="0"/>
+                <w:numId w:val="23"/>
+              </w:numPr>
+              <w:spacing w:line="276" w:lineRule="auto"/>
+              <w:rPr>
+                <w:rFonts w:ascii="Times New Roman" w:hAnsi="Times New Roman"/>
+                <w:sz w:val="20"/>
+              </w:rPr>
+            </w:pPr>
+            <w:r>
+              <w:rPr>
+                <w:rFonts w:ascii="Times New Roman" w:hAnsi="Times New Roman"/>
+                <w:sz w:val="20"/>
+              </w:rPr>
+              <w:t>Completed section 4</w:t>
+            </w:r>
+          </w:p>
+          <w:p>
+            <w:pPr>
+              <w:pStyle w:val="ListParagraph"/>
+              <w:numPr>
+                <w:ilvl w:val="0"/>
+                <w:numId w:val="23"/>
+              </w:numPr>
+              <w:spacing w:line="276" w:lineRule="auto"/>
+              <w:rPr>
+                <w:rFonts w:ascii="Times New Roman" w:hAnsi="Times New Roman"/>
+                <w:sz w:val="20"/>
+              </w:rPr>
+            </w:pPr>
+            <w:r>
+              <w:rPr>
+                <w:rFonts w:ascii="Times New Roman" w:hAnsi="Times New Roman"/>
+                <w:sz w:val="20"/>
+              </w:rPr>
+              <w:t>Contributed to section 7</w:t>
+            </w:r>
+          </w:p>
+          <w:p>
+            <w:pPr>
+              <w:pStyle w:val="ListParagraph"/>
+              <w:numPr>
+                <w:ilvl w:val="0"/>
+                <w:numId w:val="23"/>
+              </w:numPr>
+              <w:spacing w:line="276" w:lineRule="auto"/>
+              <w:rPr>
+                <w:rFonts w:ascii="Times New Roman" w:hAnsi="Times New Roman"/>
+                <w:sz w:val="20"/>
+              </w:rPr>
+            </w:pPr>
+            <w:r>
+              <w:rPr>
+                <w:rFonts w:ascii="Times New Roman" w:hAnsi="Times New Roman"/>
+                <w:sz w:val="20"/>
+              </w:rPr>
+              <w:t>Assembled, formatted, and submitted final document</w:t>
+            </w:r>
+          </w:p>
+          <w:p>
+            <w:pPr>
+              <w:pStyle w:val="ListParagraph"/>
+              <w:numPr>
+                <w:ilvl w:val="0"/>
+                <w:numId w:val="23"/>
+              </w:numPr>
+              <w:spacing w:line="276" w:lineRule="auto"/>
+              <w:rPr>
+                <w:rFonts w:ascii="Times New Roman" w:hAnsi="Times New Roman"/>
+                <w:sz w:val="20"/>
+              </w:rPr>
+            </w:pPr>
+            <w:r>
+              <w:rPr>
+                <w:rFonts w:ascii="Times New Roman" w:hAnsi="Times New Roman"/>
+                <w:sz w:val="20"/>
+              </w:rPr>
+              <w:t>Revised other sections, see Revision History</w:t>
+            </w:r>
+          </w:p>
+          <w:p>
+            <w:pPr>
+              <w:pStyle w:val="ListParagraph"/>
+              <w:numPr>
+                <w:ilvl w:val="0"/>
+                <w:numId w:val="23"/>
+              </w:numPr>
               <w:spacing w:line="276" w:lineRule="auto"/>
               <w:rPr>
                 <w:rFonts w:ascii="Times New Roman" w:hAnsi="Times New Roman"/>
@@ -4182,6 +4651,48 @@
           </w:tcPr>
           <w:p>
             <w:pPr>
+              <w:pStyle w:val="ListParagraph"/>
+              <w:numPr>
+                <w:ilvl w:val="0"/>
+                <w:numId w:val="23"/>
+              </w:numPr>
+              <w:spacing w:line="276" w:lineRule="auto"/>
+              <w:rPr>
+                <w:rFonts w:ascii="Times New Roman" w:hAnsi="Times New Roman"/>
+                <w:sz w:val="20"/>
+              </w:rPr>
+            </w:pPr>
+            <w:r>
+              <w:rPr>
+                <w:rFonts w:ascii="Times New Roman" w:hAnsi="Times New Roman"/>
+                <w:sz w:val="20"/>
+              </w:rPr>
+              <w:t>Completed section 1</w:t>
+            </w:r>
+          </w:p>
+          <w:p>
+            <w:pPr>
+              <w:pStyle w:val="ListParagraph"/>
+              <w:numPr>
+                <w:ilvl w:val="0"/>
+                <w:numId w:val="23"/>
+              </w:numPr>
+              <w:spacing w:line="276" w:lineRule="auto"/>
+              <w:rPr>
+                <w:rFonts w:ascii="Times New Roman" w:hAnsi="Times New Roman"/>
+                <w:sz w:val="20"/>
+              </w:rPr>
+            </w:pPr>
+            <w:r>
+              <w:rPr>
+                <w:rFonts w:ascii="Times New Roman" w:hAnsi="Times New Roman"/>
+                <w:sz w:val="20"/>
+              </w:rPr>
+              <w:t>Completed section 2</w:t>
+            </w:r>
+          </w:p>
+          <w:p>
+            <w:pPr>
               <w:spacing w:line="276" w:lineRule="auto"/>
               <w:rPr>
                 <w:rFonts w:ascii="Times New Roman" w:hAnsi="Times New Roman"/>
@@ -4207,6 +4718,7 @@
                 <w:sz w:val="20"/>
               </w:rPr>
             </w:pPr>
+            <w:proofErr w:type="spellStart"/>
             <w:r>
               <w:rPr>
                 <w:rFonts w:ascii="Times New Roman" w:hAnsi="Times New Roman"/>
@@ -4214,12 +4726,55 @@
               </w:rPr>
               <w:t>Tehrence</w:t>
             </w:r>
+            <w:proofErr w:type="spellEnd"/>
           </w:p>
         </w:tc>
         <w:tc>
           <w:tcPr>
             <w:tcW w:w="3590" w:type="dxa"/>
           </w:tcPr>
+          <w:p>
+            <w:pPr>
+              <w:pStyle w:val="ListParagraph"/>
+              <w:numPr>
+                <w:ilvl w:val="0"/>
+                <w:numId w:val="23"/>
+              </w:numPr>
+              <w:spacing w:line="276" w:lineRule="auto"/>
+              <w:rPr>
+                <w:rFonts w:ascii="Times New Roman" w:hAnsi="Times New Roman"/>
+                <w:sz w:val="20"/>
+              </w:rPr>
+            </w:pPr>
+            <w:r>
+              <w:rPr>
+                <w:rFonts w:ascii="Times New Roman" w:hAnsi="Times New Roman"/>
+                <w:sz w:val="20"/>
+              </w:rPr>
+              <w:t xml:space="preserve">Completed section 3 </w:t>
+            </w:r>
+          </w:p>
+          <w:p>
+            <w:pPr>
+              <w:pStyle w:val="ListParagraph"/>
+              <w:numPr>
+                <w:ilvl w:val="0"/>
+                <w:numId w:val="23"/>
+              </w:numPr>
+              <w:spacing w:line="276" w:lineRule="auto"/>
+              <w:rPr>
+                <w:rFonts w:ascii="Times New Roman" w:hAnsi="Times New Roman"/>
+                <w:sz w:val="20"/>
+              </w:rPr>
+            </w:pPr>
+            <w:r>
+              <w:rPr>
+                <w:rFonts w:ascii="Times New Roman" w:hAnsi="Times New Roman"/>
+                <w:sz w:val="20"/>
+              </w:rPr>
+              <w:t>Completed section 6</w:t>
+            </w:r>
+          </w:p>
           <w:p>
             <w:pPr>
               <w:spacing w:line="276" w:lineRule="auto"/>
@@ -4260,6 +4815,610 @@
           <w:tcPr>
             <w:tcW w:w="3590" w:type="dxa"/>
           </w:tcPr>
+          <w:p>
+            <w:pPr>
+              <w:pStyle w:val="ListParagraph"/>
+              <w:numPr>
+                <w:ilvl w:val="0"/>
+                <w:numId w:val="23"/>
+              </w:numPr>
+              <w:spacing w:line="276" w:lineRule="auto"/>
+              <w:rPr>
+                <w:rFonts w:ascii="Times New Roman" w:hAnsi="Times New Roman"/>
+                <w:sz w:val="20"/>
+              </w:rPr>
+            </w:pPr>
+            <w:r>
+              <w:rPr>
+                <w:rFonts w:ascii="Times New Roman" w:hAnsi="Times New Roman"/>
+                <w:sz w:val="20"/>
+              </w:rPr>
+              <w:t>Completed section 5</w:t>
+            </w:r>
+          </w:p>
+          <w:p>
+            <w:pPr>
+              <w:pStyle w:val="ListParagraph"/>
+              <w:numPr>
+                <w:ilvl w:val="0"/>
+                <w:numId w:val="23"/>
+              </w:numPr>
+              <w:spacing w:line="276" w:lineRule="auto"/>
+              <w:rPr>
+                <w:rFonts w:ascii="Times New Roman" w:hAnsi="Times New Roman"/>
+                <w:sz w:val="20"/>
+              </w:rPr>
+            </w:pPr>
+            <w:r>
+              <w:rPr>
+                <w:rFonts w:ascii="Times New Roman" w:hAnsi="Times New Roman"/>
+                <w:sz w:val="20"/>
+              </w:rPr>
+              <w:t>Contributed to section 7</w:t>
+            </w:r>
+          </w:p>
+          <w:p>
+            <w:pPr>
+              <w:spacing w:line="276" w:lineRule="auto"/>
+              <w:rPr>
+                <w:rFonts w:ascii="Times New Roman" w:hAnsi="Times New Roman"/>
+                <w:sz w:val="20"/>
+              </w:rPr>
+            </w:pPr>
+          </w:p>
+        </w:tc>
+      </w:tr>
+    </w:tbl>
+    <w:p>
+      <w:pPr>
+        <w:spacing w:line="276" w:lineRule="auto"/>
+        <w:rPr>
+          <w:rFonts w:ascii="Times New Roman" w:hAnsi="Times New Roman"/>
+          <w:sz w:val="20"/>
+        </w:rPr>
+      </w:pPr>
+    </w:p>
+    <w:p>
+      <w:pPr>
+        <w:spacing w:line="276" w:lineRule="auto"/>
+        <w:rPr>
+          <w:rFonts w:ascii="Times New Roman" w:hAnsi="Times New Roman"/>
+          <w:sz w:val="20"/>
+        </w:rPr>
+      </w:pPr>
+    </w:p>
+    <w:p>
+      <w:pPr>
+        <w:pStyle w:val="TOCEntry"/>
+        <w:spacing w:before="0" w:after="0" w:line="276" w:lineRule="auto"/>
+        <w:rPr>
+          <w:rFonts w:ascii="Times New Roman" w:hAnsi="Times New Roman"/>
+          <w:szCs w:val="36"/>
+        </w:rPr>
+      </w:pPr>
+      <w:r>
+        <w:rPr>
+          <w:rFonts w:ascii="Times New Roman" w:hAnsi="Times New Roman"/>
+          <w:szCs w:val="36"/>
+        </w:rPr>
+        <w:t xml:space="preserve">SRS </w:t>
+      </w:r>
+      <w:r>
+        <w:rPr>
+          <w:rFonts w:ascii="Times New Roman" w:hAnsi="Times New Roman"/>
+          <w:szCs w:val="36"/>
+        </w:rPr>
+        <w:t>PowerPoint</w:t>
+      </w:r>
+      <w:r>
+        <w:rPr>
+          <w:rFonts w:ascii="Times New Roman" w:hAnsi="Times New Roman"/>
+          <w:szCs w:val="36"/>
+        </w:rPr>
+        <w:t xml:space="preserve"> </w:t>
+      </w:r>
+      <w:r>
+        <w:rPr>
+          <w:rFonts w:ascii="Times New Roman" w:hAnsi="Times New Roman"/>
+          <w:szCs w:val="36"/>
+        </w:rPr>
+        <w:t>Contribution Summary</w:t>
+      </w:r>
+    </w:p>
+    <w:p>
+      <w:pPr>
+        <w:pStyle w:val="TOCEntry"/>
+        <w:spacing w:before="0" w:after="0" w:line="276" w:lineRule="auto"/>
+        <w:rPr>
+          <w:rFonts w:ascii="Times New Roman" w:hAnsi="Times New Roman"/>
+          <w:b w:val="0"/>
+          <w:bCs/>
+          <w:i/>
+          <w:iCs/>
+          <w:sz w:val="20"/>
+        </w:rPr>
+      </w:pPr>
+      <w:r>
+        <w:rPr>
+          <w:rFonts w:ascii="Times New Roman" w:hAnsi="Times New Roman"/>
+          <w:b w:val="0"/>
+          <w:bCs/>
+          <w:i/>
+          <w:iCs/>
+          <w:sz w:val="20"/>
+        </w:rPr>
+        <w:t>Completed refers to work done nearly or entirely solo. Contributed refers to work done as partners or a team</w:t>
+      </w:r>
+    </w:p>
+    <w:tbl>
+      <w:tblPr>
+        <w:tblW w:w="9885" w:type="dxa"/>
+        <w:tblBorders>
+          <w:top w:val="single" w:sz="12" w:space="0" w:color="auto"/>
+          <w:left w:val="single" w:sz="12" w:space="0" w:color="auto"/>
+          <w:bottom w:val="single" w:sz="12" w:space="0" w:color="auto"/>
+          <w:right w:val="single" w:sz="12" w:space="0" w:color="auto"/>
+          <w:insideH w:val="single" w:sz="6" w:space="0" w:color="auto"/>
+          <w:insideV w:val="single" w:sz="6" w:space="0" w:color="auto"/>
+        </w:tblBorders>
+        <w:tblLayout w:type="fixed"/>
+        <w:tblLook w:val="0000" w:firstRow="0" w:lastRow="0" w:firstColumn="0" w:lastColumn="0" w:noHBand="0" w:noVBand="0"/>
+      </w:tblPr>
+      <w:tblGrid>
+        <w:gridCol w:w="6295"/>
+        <w:gridCol w:w="3590"/>
+      </w:tblGrid>
+      <w:tr>
+        <w:trPr>
+          <w:trHeight w:val="268"/>
+        </w:trPr>
+        <w:tc>
+          <w:tcPr>
+            <w:tcW w:w="6295" w:type="dxa"/>
+            <w:tcBorders>
+              <w:top w:val="single" w:sz="12" w:space="0" w:color="auto"/>
+              <w:bottom w:val="double" w:sz="12" w:space="0" w:color="auto"/>
+            </w:tcBorders>
+          </w:tcPr>
+          <w:p>
+            <w:pPr>
+              <w:spacing w:line="276" w:lineRule="auto"/>
+              <w:rPr>
+                <w:rFonts w:ascii="Times New Roman" w:hAnsi="Times New Roman"/>
+                <w:b/>
+                <w:sz w:val="20"/>
+              </w:rPr>
+            </w:pPr>
+            <w:r>
+              <w:rPr>
+                <w:rFonts w:ascii="Times New Roman" w:hAnsi="Times New Roman"/>
+                <w:b/>
+                <w:sz w:val="20"/>
+              </w:rPr>
+              <w:t>Name</w:t>
+            </w:r>
+          </w:p>
+        </w:tc>
+        <w:tc>
+          <w:tcPr>
+            <w:tcW w:w="3590" w:type="dxa"/>
+            <w:tcBorders>
+              <w:top w:val="single" w:sz="12" w:space="0" w:color="auto"/>
+              <w:bottom w:val="double" w:sz="12" w:space="0" w:color="auto"/>
+            </w:tcBorders>
+          </w:tcPr>
+          <w:p>
+            <w:pPr>
+              <w:spacing w:line="276" w:lineRule="auto"/>
+              <w:rPr>
+                <w:rFonts w:ascii="Times New Roman" w:hAnsi="Times New Roman"/>
+                <w:b/>
+                <w:sz w:val="20"/>
+              </w:rPr>
+            </w:pPr>
+            <w:r>
+              <w:rPr>
+                <w:rFonts w:ascii="Times New Roman" w:hAnsi="Times New Roman"/>
+                <w:b/>
+                <w:sz w:val="20"/>
+              </w:rPr>
+              <w:t>Contributions</w:t>
+            </w:r>
+          </w:p>
+        </w:tc>
+      </w:tr>
+      <w:tr>
+        <w:trPr>
+          <w:trHeight w:val="167"/>
+        </w:trPr>
+        <w:tc>
+          <w:tcPr>
+            <w:tcW w:w="6295" w:type="dxa"/>
+            <w:tcBorders>
+              <w:top w:val="nil"/>
+            </w:tcBorders>
+          </w:tcPr>
+          <w:p>
+            <w:pPr>
+              <w:spacing w:line="276" w:lineRule="auto"/>
+              <w:rPr>
+                <w:rFonts w:ascii="Times New Roman" w:hAnsi="Times New Roman"/>
+                <w:sz w:val="20"/>
+              </w:rPr>
+            </w:pPr>
+            <w:r>
+              <w:rPr>
+                <w:rFonts w:ascii="Times New Roman" w:hAnsi="Times New Roman"/>
+                <w:sz w:val="20"/>
+              </w:rPr>
+              <w:t>Hudson</w:t>
+            </w:r>
+          </w:p>
+        </w:tc>
+        <w:tc>
+          <w:tcPr>
+            <w:tcW w:w="3590" w:type="dxa"/>
+            <w:tcBorders>
+              <w:top w:val="nil"/>
+            </w:tcBorders>
+          </w:tcPr>
+          <w:p>
+            <w:pPr>
+              <w:pStyle w:val="ListParagraph"/>
+              <w:numPr>
+                <w:ilvl w:val="0"/>
+                <w:numId w:val="23"/>
+              </w:numPr>
+              <w:spacing w:line="276" w:lineRule="auto"/>
+              <w:rPr>
+                <w:rFonts w:ascii="Times New Roman" w:hAnsi="Times New Roman"/>
+                <w:sz w:val="20"/>
+              </w:rPr>
+            </w:pPr>
+            <w:r>
+              <w:rPr>
+                <w:rFonts w:ascii="Times New Roman" w:hAnsi="Times New Roman"/>
+                <w:sz w:val="20"/>
+              </w:rPr>
+              <w:t>Completed slide 1</w:t>
+            </w:r>
+          </w:p>
+          <w:p>
+            <w:pPr>
+              <w:pStyle w:val="ListParagraph"/>
+              <w:numPr>
+                <w:ilvl w:val="0"/>
+                <w:numId w:val="23"/>
+              </w:numPr>
+              <w:spacing w:line="276" w:lineRule="auto"/>
+              <w:rPr>
+                <w:rFonts w:ascii="Times New Roman" w:hAnsi="Times New Roman"/>
+                <w:sz w:val="20"/>
+              </w:rPr>
+            </w:pPr>
+            <w:r>
+              <w:rPr>
+                <w:rFonts w:ascii="Times New Roman" w:hAnsi="Times New Roman"/>
+                <w:sz w:val="20"/>
+              </w:rPr>
+              <w:t>Completed slide 7</w:t>
+            </w:r>
+          </w:p>
+          <w:p>
+            <w:pPr>
+              <w:pStyle w:val="ListParagraph"/>
+              <w:numPr>
+                <w:ilvl w:val="0"/>
+                <w:numId w:val="23"/>
+              </w:numPr>
+              <w:spacing w:line="276" w:lineRule="auto"/>
+              <w:rPr>
+                <w:rFonts w:ascii="Times New Roman" w:hAnsi="Times New Roman"/>
+                <w:sz w:val="20"/>
+              </w:rPr>
+            </w:pPr>
+            <w:r>
+              <w:rPr>
+                <w:rFonts w:ascii="Times New Roman" w:hAnsi="Times New Roman"/>
+                <w:sz w:val="20"/>
+              </w:rPr>
+              <w:t>Completed slide 8</w:t>
+            </w:r>
+          </w:p>
+          <w:p>
+            <w:pPr>
+              <w:pStyle w:val="ListParagraph"/>
+              <w:numPr>
+                <w:ilvl w:val="0"/>
+                <w:numId w:val="23"/>
+              </w:numPr>
+              <w:spacing w:line="276" w:lineRule="auto"/>
+              <w:rPr>
+                <w:rFonts w:ascii="Times New Roman" w:hAnsi="Times New Roman"/>
+                <w:sz w:val="20"/>
+              </w:rPr>
+            </w:pPr>
+            <w:r>
+              <w:rPr>
+                <w:rFonts w:ascii="Times New Roman" w:hAnsi="Times New Roman"/>
+                <w:sz w:val="20"/>
+              </w:rPr>
+              <w:t>Completed slide 13</w:t>
+            </w:r>
+          </w:p>
+          <w:p>
+            <w:pPr>
+              <w:pStyle w:val="ListParagraph"/>
+              <w:numPr>
+                <w:ilvl w:val="0"/>
+                <w:numId w:val="23"/>
+              </w:numPr>
+              <w:spacing w:line="276" w:lineRule="auto"/>
+              <w:rPr>
+                <w:rFonts w:ascii="Times New Roman" w:hAnsi="Times New Roman"/>
+                <w:sz w:val="20"/>
+              </w:rPr>
+            </w:pPr>
+            <w:r>
+              <w:rPr>
+                <w:rFonts w:ascii="Times New Roman" w:hAnsi="Times New Roman"/>
+                <w:sz w:val="20"/>
+              </w:rPr>
+              <w:t>Formatted, assembled, and stylized final document</w:t>
+            </w:r>
+          </w:p>
+          <w:p>
+            <w:pPr>
+              <w:pStyle w:val="ListParagraph"/>
+              <w:spacing w:line="276" w:lineRule="auto"/>
+              <w:rPr>
+                <w:rFonts w:ascii="Times New Roman" w:hAnsi="Times New Roman"/>
+                <w:sz w:val="20"/>
+              </w:rPr>
+            </w:pPr>
+          </w:p>
+        </w:tc>
+      </w:tr>
+      <w:tr>
+        <w:trPr>
+          <w:trHeight w:val="277"/>
+        </w:trPr>
+        <w:tc>
+          <w:tcPr>
+            <w:tcW w:w="6295" w:type="dxa"/>
+          </w:tcPr>
+          <w:p>
+            <w:pPr>
+              <w:tabs>
+                <w:tab w:val="left" w:pos="1761"/>
+              </w:tabs>
+              <w:spacing w:line="276" w:lineRule="auto"/>
+              <w:rPr>
+                <w:rFonts w:ascii="Times New Roman" w:hAnsi="Times New Roman"/>
+                <w:sz w:val="20"/>
+              </w:rPr>
+            </w:pPr>
+            <w:r>
+              <w:rPr>
+                <w:rFonts w:ascii="Times New Roman" w:hAnsi="Times New Roman"/>
+                <w:sz w:val="20"/>
+              </w:rPr>
+              <w:t>Eddie</w:t>
+            </w:r>
+          </w:p>
+        </w:tc>
+        <w:tc>
+          <w:tcPr>
+            <w:tcW w:w="3590" w:type="dxa"/>
+          </w:tcPr>
+          <w:p>
+            <w:pPr>
+              <w:pStyle w:val="ListParagraph"/>
+              <w:numPr>
+                <w:ilvl w:val="0"/>
+                <w:numId w:val="23"/>
+              </w:numPr>
+              <w:spacing w:line="276" w:lineRule="auto"/>
+              <w:rPr>
+                <w:rFonts w:ascii="Times New Roman" w:hAnsi="Times New Roman"/>
+                <w:sz w:val="20"/>
+              </w:rPr>
+            </w:pPr>
+            <w:r>
+              <w:rPr>
+                <w:rFonts w:ascii="Times New Roman" w:hAnsi="Times New Roman"/>
+                <w:sz w:val="20"/>
+              </w:rPr>
+              <w:t xml:space="preserve">Completed </w:t>
+            </w:r>
+            <w:r>
+              <w:rPr>
+                <w:rFonts w:ascii="Times New Roman" w:hAnsi="Times New Roman"/>
+                <w:sz w:val="20"/>
+              </w:rPr>
+              <w:t>slide</w:t>
+            </w:r>
+          </w:p>
+          <w:p>
+            <w:pPr>
+              <w:spacing w:line="276" w:lineRule="auto"/>
+              <w:rPr>
+                <w:rFonts w:ascii="Times New Roman" w:hAnsi="Times New Roman"/>
+                <w:sz w:val="20"/>
+              </w:rPr>
+            </w:pPr>
+          </w:p>
+        </w:tc>
+      </w:tr>
+      <w:tr>
+        <w:trPr>
+          <w:trHeight w:val="268"/>
+        </w:trPr>
+        <w:tc>
+          <w:tcPr>
+            <w:tcW w:w="6295" w:type="dxa"/>
+          </w:tcPr>
+          <w:p>
+            <w:pPr>
+              <w:spacing w:line="276" w:lineRule="auto"/>
+              <w:rPr>
+                <w:rFonts w:ascii="Times New Roman" w:hAnsi="Times New Roman"/>
+                <w:sz w:val="20"/>
+              </w:rPr>
+            </w:pPr>
+            <w:proofErr w:type="spellStart"/>
+            <w:r>
+              <w:rPr>
+                <w:rFonts w:ascii="Times New Roman" w:hAnsi="Times New Roman"/>
+                <w:sz w:val="20"/>
+              </w:rPr>
+              <w:t>Tehrence</w:t>
+            </w:r>
+            <w:proofErr w:type="spellEnd"/>
+          </w:p>
+        </w:tc>
+        <w:tc>
+          <w:tcPr>
+            <w:tcW w:w="3590" w:type="dxa"/>
+          </w:tcPr>
+          <w:p>
+            <w:pPr>
+              <w:pStyle w:val="ListParagraph"/>
+              <w:numPr>
+                <w:ilvl w:val="0"/>
+                <w:numId w:val="23"/>
+              </w:numPr>
+              <w:spacing w:line="276" w:lineRule="auto"/>
+              <w:rPr>
+                <w:rFonts w:ascii="Times New Roman" w:hAnsi="Times New Roman"/>
+                <w:sz w:val="20"/>
+              </w:rPr>
+            </w:pPr>
+            <w:r>
+              <w:rPr>
+                <w:rFonts w:ascii="Times New Roman" w:hAnsi="Times New Roman"/>
+                <w:sz w:val="20"/>
+              </w:rPr>
+              <w:t xml:space="preserve">Completed </w:t>
+            </w:r>
+            <w:r>
+              <w:rPr>
+                <w:rFonts w:ascii="Times New Roman" w:hAnsi="Times New Roman"/>
+                <w:sz w:val="20"/>
+              </w:rPr>
+              <w:t>slide 10</w:t>
+            </w:r>
+          </w:p>
+          <w:p>
+            <w:pPr>
+              <w:pStyle w:val="ListParagraph"/>
+              <w:numPr>
+                <w:ilvl w:val="0"/>
+                <w:numId w:val="23"/>
+              </w:numPr>
+              <w:spacing w:line="276" w:lineRule="auto"/>
+              <w:rPr>
+                <w:rFonts w:ascii="Times New Roman" w:hAnsi="Times New Roman"/>
+                <w:sz w:val="20"/>
+              </w:rPr>
+            </w:pPr>
+            <w:r>
+              <w:rPr>
+                <w:rFonts w:ascii="Times New Roman" w:hAnsi="Times New Roman"/>
+                <w:sz w:val="20"/>
+              </w:rPr>
+              <w:t>Completed slide 11</w:t>
+            </w:r>
+          </w:p>
+          <w:p>
+            <w:pPr>
+              <w:pStyle w:val="ListParagraph"/>
+              <w:numPr>
+                <w:ilvl w:val="0"/>
+                <w:numId w:val="23"/>
+              </w:numPr>
+              <w:spacing w:line="276" w:lineRule="auto"/>
+              <w:rPr>
+                <w:rFonts w:ascii="Times New Roman" w:hAnsi="Times New Roman"/>
+                <w:sz w:val="20"/>
+              </w:rPr>
+            </w:pPr>
+            <w:r>
+              <w:rPr>
+                <w:rFonts w:ascii="Times New Roman" w:hAnsi="Times New Roman"/>
+                <w:sz w:val="20"/>
+              </w:rPr>
+              <w:t>Completed slide 12</w:t>
+            </w:r>
+          </w:p>
+          <w:p>
+            <w:pPr>
+              <w:spacing w:line="276" w:lineRule="auto"/>
+              <w:rPr>
+                <w:rFonts w:ascii="Times New Roman" w:hAnsi="Times New Roman"/>
+                <w:sz w:val="20"/>
+              </w:rPr>
+            </w:pPr>
+          </w:p>
+        </w:tc>
+      </w:tr>
+      <w:tr>
+        <w:trPr>
+          <w:trHeight w:val="268"/>
+        </w:trPr>
+        <w:tc>
+          <w:tcPr>
+            <w:tcW w:w="6295" w:type="dxa"/>
+          </w:tcPr>
+          <w:p>
+            <w:pPr>
+              <w:spacing w:line="276" w:lineRule="auto"/>
+              <w:rPr>
+                <w:rFonts w:ascii="Times New Roman" w:hAnsi="Times New Roman"/>
+                <w:sz w:val="20"/>
+              </w:rPr>
+            </w:pPr>
+            <w:r>
+              <w:rPr>
+                <w:rFonts w:ascii="Times New Roman" w:hAnsi="Times New Roman"/>
+                <w:sz w:val="20"/>
+              </w:rPr>
+              <w:t>Jaden</w:t>
+            </w:r>
+          </w:p>
+        </w:tc>
+        <w:tc>
+          <w:tcPr>
+            <w:tcW w:w="3590" w:type="dxa"/>
+          </w:tcPr>
+          <w:p>
+            <w:pPr>
+              <w:pStyle w:val="ListParagraph"/>
+              <w:numPr>
+                <w:ilvl w:val="0"/>
+                <w:numId w:val="23"/>
+              </w:numPr>
+              <w:spacing w:line="276" w:lineRule="auto"/>
+              <w:rPr>
+                <w:rFonts w:ascii="Times New Roman" w:hAnsi="Times New Roman"/>
+                <w:sz w:val="20"/>
+              </w:rPr>
+            </w:pPr>
+            <w:r>
+              <w:rPr>
+                <w:rFonts w:ascii="Times New Roman" w:hAnsi="Times New Roman"/>
+                <w:sz w:val="20"/>
+              </w:rPr>
+              <w:t>Completed s</w:t>
+            </w:r>
+            <w:r>
+              <w:rPr>
+                <w:rFonts w:ascii="Times New Roman" w:hAnsi="Times New Roman"/>
+                <w:sz w:val="20"/>
+              </w:rPr>
+              <w:t>lide 9</w:t>
+            </w:r>
+          </w:p>
           <w:p>
             <w:pPr>
               <w:spacing w:line="276" w:lineRule="auto"/>
@@ -5548,21 +6707,12 @@
           <w:sz w:val="20"/>
         </w:rPr>
       </w:pPr>
-      <w:proofErr w:type="gramStart"/>
-      <w:r>
-        <w:rPr>
-          <w:rFonts w:ascii="Times New Roman" w:hAnsi="Times New Roman"/>
-          <w:sz w:val="20"/>
-        </w:rPr>
-        <w:t>Studious</w:t>
-      </w:r>
-      <w:proofErr w:type="gramEnd"/>
-      <w:r>
-        <w:rPr>
-          <w:rFonts w:ascii="Times New Roman" w:hAnsi="Times New Roman"/>
-          <w:sz w:val="20"/>
-        </w:rPr>
-        <w:t xml:space="preserve"> is a </w:t>
+      <w:r>
+        <w:rPr>
+          <w:rFonts w:ascii="Times New Roman" w:hAnsi="Times New Roman"/>
+          <w:sz w:val="20"/>
+        </w:rPr>
+        <w:t xml:space="preserve">Studious is a </w:t>
       </w:r>
       <w:r>
         <w:rPr>
@@ -5936,21 +7086,12 @@
           <w:sz w:val="20"/>
         </w:rPr>
       </w:pPr>
-      <w:proofErr w:type="gramStart"/>
-      <w:r>
-        <w:rPr>
-          <w:rFonts w:ascii="Times New Roman" w:hAnsi="Times New Roman"/>
-          <w:sz w:val="20"/>
-        </w:rPr>
-        <w:t>Studious</w:t>
-      </w:r>
-      <w:proofErr w:type="gramEnd"/>
-      <w:r>
-        <w:rPr>
-          <w:rFonts w:ascii="Times New Roman" w:hAnsi="Times New Roman"/>
-          <w:sz w:val="20"/>
-        </w:rPr>
-        <w:t xml:space="preserve"> offers the following primary functions:</w:t>
+      <w:r>
+        <w:rPr>
+          <w:rFonts w:ascii="Times New Roman" w:hAnsi="Times New Roman"/>
+          <w:sz w:val="20"/>
+        </w:rPr>
+        <w:t>Studious offers the following primary functions:</w:t>
       </w:r>
     </w:p>
     <w:p>
@@ -6966,21 +8107,12 @@
           <w:sz w:val="20"/>
         </w:rPr>
       </w:pPr>
-      <w:proofErr w:type="gramStart"/>
-      <w:r>
-        <w:rPr>
-          <w:rFonts w:ascii="Times New Roman" w:hAnsi="Times New Roman"/>
-          <w:sz w:val="20"/>
-        </w:rPr>
-        <w:t>Studious</w:t>
-      </w:r>
-      <w:proofErr w:type="gramEnd"/>
-      <w:r>
-        <w:rPr>
-          <w:rFonts w:ascii="Times New Roman" w:hAnsi="Times New Roman"/>
-          <w:sz w:val="20"/>
-        </w:rPr>
-        <w:t xml:space="preserve"> will operate as a web-based platform accessible from most modern browsers and desktop systems.</w:t>
+      <w:r>
+        <w:rPr>
+          <w:rFonts w:ascii="Times New Roman" w:hAnsi="Times New Roman"/>
+          <w:sz w:val="20"/>
+        </w:rPr>
+        <w:t>Studious will operate as a web-based platform accessible from most modern browsers and desktop systems.</w:t>
       </w:r>
     </w:p>
     <w:p>
@@ -7158,21 +8290,12 @@
           <w:sz w:val="20"/>
         </w:rPr>
       </w:pPr>
-      <w:proofErr w:type="gramStart"/>
-      <w:r>
-        <w:rPr>
-          <w:rFonts w:ascii="Times New Roman" w:hAnsi="Times New Roman"/>
-          <w:sz w:val="20"/>
-        </w:rPr>
-        <w:t>Must</w:t>
-      </w:r>
-      <w:proofErr w:type="gramEnd"/>
-      <w:r>
-        <w:rPr>
-          <w:rFonts w:ascii="Times New Roman" w:hAnsi="Times New Roman"/>
-          <w:sz w:val="20"/>
-        </w:rPr>
-        <w:t xml:space="preserve"> be implemented using </w:t>
+      <w:r>
+        <w:rPr>
+          <w:rFonts w:ascii="Times New Roman" w:hAnsi="Times New Roman"/>
+          <w:sz w:val="20"/>
+        </w:rPr>
+        <w:t xml:space="preserve">Must be implemented using </w:t>
       </w:r>
       <w:r>
         <w:rPr>
@@ -7375,21 +8498,12 @@
           <w:sz w:val="20"/>
         </w:rPr>
       </w:pPr>
-      <w:proofErr w:type="gramStart"/>
-      <w:r>
-        <w:rPr>
-          <w:rFonts w:ascii="Times New Roman" w:hAnsi="Times New Roman"/>
-          <w:sz w:val="20"/>
-        </w:rPr>
-        <w:t>Must</w:t>
-      </w:r>
-      <w:proofErr w:type="gramEnd"/>
-      <w:r>
-        <w:rPr>
-          <w:rFonts w:ascii="Times New Roman" w:hAnsi="Times New Roman"/>
-          <w:sz w:val="20"/>
-        </w:rPr>
-        <w:t xml:space="preserve"> ensure page load and response times within </w:t>
+      <w:r>
+        <w:rPr>
+          <w:rFonts w:ascii="Times New Roman" w:hAnsi="Times New Roman"/>
+          <w:sz w:val="20"/>
+        </w:rPr>
+        <w:t xml:space="preserve">Must ensure page load and response times within </w:t>
       </w:r>
       <w:r>
         <w:rPr>
@@ -22187,23 +23301,7 @@
           <w:rFonts w:ascii="Times New Roman" w:hAnsi="Times New Roman"/>
           <w:sz w:val="20"/>
         </w:rPr>
-        <w:t xml:space="preserve">&lt;If there are performance requirements for the product under various circumstances, state them here and explain their rationale, to help the developers understand </w:t>
-      </w:r>
-      <w:proofErr w:type="gramStart"/>
-      <w:r>
-        <w:rPr>
-          <w:rFonts w:ascii="Times New Roman" w:hAnsi="Times New Roman"/>
-          <w:sz w:val="20"/>
-        </w:rPr>
-        <w:t>the</w:t>
-      </w:r>
-      <w:proofErr w:type="gramEnd"/>
-      <w:r>
-        <w:rPr>
-          <w:rFonts w:ascii="Times New Roman" w:hAnsi="Times New Roman"/>
-          <w:sz w:val="20"/>
-        </w:rPr>
-        <w:t xml:space="preserve"> intent and make suitable design choices. Specify the timing relationships for real time systems. Make such requirements as specific as possible. You may need to state performance requirements for individual functional requirements or features.&gt;</w:t>
+        <w:t>&lt;If there are performance requirements for the product under various circumstances, state them here and explain their rationale, to help the developers understand the intent and make suitable design choices. Specify the timing relationships for real time systems. Make such requirements as specific as possible. You may need to state performance requirements for individual functional requirements or features.&gt;</w:t>
       </w:r>
     </w:p>
     <w:p>
@@ -22573,17 +23671,8 @@
                 <w:rFonts w:ascii="Times New Roman" w:hAnsi="Times New Roman"/>
                 <w:sz w:val="20"/>
               </w:rPr>
-              <w:t>The system will …</w:t>
-            </w:r>
-            <w:proofErr w:type="gramStart"/>
-            <w:r>
-              <w:rPr>
-                <w:rFonts w:ascii="Times New Roman" w:hAnsi="Times New Roman"/>
-                <w:sz w:val="20"/>
-              </w:rPr>
-              <w:t>…..</w:t>
-            </w:r>
-            <w:proofErr w:type="gramEnd"/>
+              <w:t>The system will ……..</w:t>
+            </w:r>
           </w:p>
         </w:tc>
         <w:tc>
@@ -23009,17 +24098,8 @@
                 <w:rFonts w:ascii="Times New Roman" w:hAnsi="Times New Roman"/>
                 <w:sz w:val="20"/>
               </w:rPr>
-              <w:t>The system will …</w:t>
-            </w:r>
-            <w:proofErr w:type="gramStart"/>
-            <w:r>
-              <w:rPr>
-                <w:rFonts w:ascii="Times New Roman" w:hAnsi="Times New Roman"/>
-                <w:sz w:val="20"/>
-              </w:rPr>
-              <w:t>…..</w:t>
-            </w:r>
-            <w:proofErr w:type="gramEnd"/>
+              <w:t>The system will ……..</w:t>
+            </w:r>
           </w:p>
         </w:tc>
         <w:tc>
@@ -23279,23 +24359,7 @@
           <w:rFonts w:ascii="Times New Roman" w:hAnsi="Times New Roman"/>
           <w:sz w:val="20"/>
         </w:rPr>
-        <w:t xml:space="preserve">We want </w:t>
-      </w:r>
-      <w:proofErr w:type="gramStart"/>
-      <w:r>
-        <w:rPr>
-          <w:rFonts w:ascii="Times New Roman" w:hAnsi="Times New Roman"/>
-          <w:sz w:val="20"/>
-        </w:rPr>
-        <w:t>secure</w:t>
-      </w:r>
-      <w:proofErr w:type="gramEnd"/>
-      <w:r>
-        <w:rPr>
-          <w:rFonts w:ascii="Times New Roman" w:hAnsi="Times New Roman"/>
-          <w:sz w:val="20"/>
-        </w:rPr>
-        <w:t xml:space="preserve"> authentication</w:t>
+        <w:t>We want secure authentication</w:t>
       </w:r>
     </w:p>
     <w:p>
@@ -23649,17 +24713,8 @@
                 <w:rFonts w:ascii="Times New Roman" w:hAnsi="Times New Roman"/>
                 <w:sz w:val="20"/>
               </w:rPr>
-              <w:t>The system will …</w:t>
-            </w:r>
-            <w:proofErr w:type="gramStart"/>
-            <w:r>
-              <w:rPr>
-                <w:rFonts w:ascii="Times New Roman" w:hAnsi="Times New Roman"/>
-                <w:sz w:val="20"/>
-              </w:rPr>
-              <w:t>…..</w:t>
-            </w:r>
-            <w:proofErr w:type="gramEnd"/>
+              <w:t>The system will ……..</w:t>
+            </w:r>
           </w:p>
         </w:tc>
         <w:tc>
@@ -23761,23 +24816,7 @@
           <w:rFonts w:ascii="Times New Roman" w:hAnsi="Times New Roman"/>
           <w:sz w:val="20"/>
         </w:rPr>
-        <w:t xml:space="preserve">&lt;Specify any additional quality characteristics for the product that will be important to either the customers or the developers. Some to consider </w:t>
-      </w:r>
-      <w:proofErr w:type="gramStart"/>
-      <w:r>
-        <w:rPr>
-          <w:rFonts w:ascii="Times New Roman" w:hAnsi="Times New Roman"/>
-          <w:sz w:val="20"/>
-        </w:rPr>
-        <w:t>are:</w:t>
-      </w:r>
-      <w:proofErr w:type="gramEnd"/>
-      <w:r>
-        <w:rPr>
-          <w:rFonts w:ascii="Times New Roman" w:hAnsi="Times New Roman"/>
-          <w:sz w:val="20"/>
-        </w:rPr>
-        <w:t xml:space="preserve"> adaptability, availability, correctness, flexibility, interoperability, maintainability, portability, reliability, reusability, robustness, testability, and usability. Write these to be specific, quantitative, and verifiable when possible. At the least, clarify the relative preferences for various attributes, such as ease of use over ease of learning.&gt;</w:t>
+        <w:t>&lt;Specify any additional quality characteristics for the product that will be important to either the customers or the developers. Some to consider are: adaptability, availability, correctness, flexibility, interoperability, maintainability, portability, reliability, reusability, robustness, testability, and usability. Write these to be specific, quantitative, and verifiable when possible. At the least, clarify the relative preferences for various attributes, such as ease of use over ease of learning.&gt;</w:t>
       </w:r>
     </w:p>
     <w:p>
@@ -24164,17 +25203,8 @@
                 <w:rFonts w:ascii="Times New Roman" w:hAnsi="Times New Roman"/>
                 <w:sz w:val="20"/>
               </w:rPr>
-              <w:t>The system will …</w:t>
-            </w:r>
-            <w:proofErr w:type="gramStart"/>
-            <w:r>
-              <w:rPr>
-                <w:rFonts w:ascii="Times New Roman" w:hAnsi="Times New Roman"/>
-                <w:sz w:val="20"/>
-              </w:rPr>
-              <w:t>…..</w:t>
-            </w:r>
-            <w:proofErr w:type="gramEnd"/>
+              <w:t>The system will ……..</w:t>
+            </w:r>
           </w:p>
         </w:tc>
         <w:tc>
@@ -24253,25 +25283,7 @@
           <w:sz w:val="20"/>
           <w:highlight w:val="yellow"/>
         </w:rPr>
-        <w:t xml:space="preserve">Add </w:t>
-      </w:r>
-      <w:proofErr w:type="gramStart"/>
-      <w:r>
-        <w:rPr>
-          <w:rFonts w:ascii="Times New Roman" w:hAnsi="Times New Roman"/>
-          <w:sz w:val="20"/>
-          <w:highlight w:val="yellow"/>
-        </w:rPr>
-        <w:t>any and all</w:t>
-      </w:r>
-      <w:proofErr w:type="gramEnd"/>
-      <w:r>
-        <w:rPr>
-          <w:rFonts w:ascii="Times New Roman" w:hAnsi="Times New Roman"/>
-          <w:sz w:val="20"/>
-          <w:highlight w:val="yellow"/>
-        </w:rPr>
-        <w:t xml:space="preserve"> of the non-functional requirements defined below, to ensure a complete set of technical and system requirements</w:t>
+        <w:t>Add any and all of the non-functional requirements defined below, to ensure a complete set of technical and system requirements</w:t>
       </w:r>
       <w:r>
         <w:rPr>
@@ -27836,21 +28848,12 @@
                 <w:sz w:val="20"/>
               </w:rPr>
             </w:pPr>
-            <w:proofErr w:type="gramStart"/>
-            <w:r>
-              <w:rPr>
-                <w:rFonts w:ascii="Times New Roman" w:hAnsi="Times New Roman"/>
-                <w:sz w:val="20"/>
-              </w:rPr>
-              <w:t>Provide</w:t>
-            </w:r>
-            <w:proofErr w:type="gramEnd"/>
-            <w:r>
-              <w:rPr>
-                <w:rFonts w:ascii="Times New Roman" w:hAnsi="Times New Roman"/>
-                <w:sz w:val="20"/>
-              </w:rPr>
-              <w:t xml:space="preserve"> a way for users to upload information about their current coursework, grade level, and attending school</w:t>
+            <w:r>
+              <w:rPr>
+                <w:rFonts w:ascii="Times New Roman" w:hAnsi="Times New Roman"/>
+                <w:sz w:val="20"/>
+              </w:rPr>
+              <w:t>Provide a way for users to upload information about their current coursework, grade level, and attending school</w:t>
             </w:r>
           </w:p>
         </w:tc>
@@ -28556,23 +29559,7 @@
           <w:rFonts w:ascii="Times New Roman" w:hAnsi="Times New Roman"/>
           <w:sz w:val="20"/>
         </w:rPr>
-        <w:t xml:space="preserve">&lt;Define all the terms necessary to properly interpret the SRS, including acronyms and abbreviations. You may wish to build a separate glossary that spans multiple projects or the entire </w:t>
-      </w:r>
-      <w:proofErr w:type="gramStart"/>
-      <w:r>
-        <w:rPr>
-          <w:rFonts w:ascii="Times New Roman" w:hAnsi="Times New Roman"/>
-          <w:sz w:val="20"/>
-        </w:rPr>
-        <w:t>organization, and</w:t>
-      </w:r>
-      <w:proofErr w:type="gramEnd"/>
-      <w:r>
-        <w:rPr>
-          <w:rFonts w:ascii="Times New Roman" w:hAnsi="Times New Roman"/>
-          <w:sz w:val="20"/>
-        </w:rPr>
-        <w:t xml:space="preserve"> just include terms specific to a single project in each SRS.&gt;</w:t>
+        <w:t>&lt;Define all the terms necessary to properly interpret the SRS, including acronyms and abbreviations. You may wish to build a separate glossary that spans multiple projects or the entire organization, and just include terms specific to a single project in each SRS.&gt;</w:t>
       </w:r>
     </w:p>
     <w:p>
@@ -28694,25 +29681,7 @@
           <w:sz w:val="20"/>
           <w:highlight w:val="yellow"/>
         </w:rPr>
-        <w:t xml:space="preserve">List here any open questions or things you know still need to be done to the </w:t>
-      </w:r>
-      <w:proofErr w:type="gramStart"/>
-      <w:r>
-        <w:rPr>
-          <w:rFonts w:ascii="Times New Roman" w:hAnsi="Times New Roman"/>
-          <w:sz w:val="20"/>
-          <w:highlight w:val="yellow"/>
-        </w:rPr>
-        <w:t>SRS, but</w:t>
-      </w:r>
-      <w:proofErr w:type="gramEnd"/>
-      <w:r>
-        <w:rPr>
-          <w:rFonts w:ascii="Times New Roman" w:hAnsi="Times New Roman"/>
-          <w:sz w:val="20"/>
-          <w:highlight w:val="yellow"/>
-        </w:rPr>
-        <w:t xml:space="preserve"> haven’t been addressed yet.</w:t>
+        <w:t>List here any open questions or things you know still need to be done to the SRS, but haven’t been addressed yet.</w:t>
       </w:r>
       <w:r>
         <w:rPr>
@@ -28741,21 +29710,12 @@
           <w:sz w:val="20"/>
         </w:rPr>
       </w:pPr>
-      <w:proofErr w:type="gramStart"/>
-      <w:r>
-        <w:rPr>
-          <w:rFonts w:ascii="Times New Roman" w:hAnsi="Times New Roman"/>
-          <w:sz w:val="20"/>
-        </w:rPr>
-        <w:t>Not</w:t>
-      </w:r>
-      <w:proofErr w:type="gramEnd"/>
-      <w:r>
-        <w:rPr>
-          <w:rFonts w:ascii="Times New Roman" w:hAnsi="Times New Roman"/>
-          <w:sz w:val="20"/>
-        </w:rPr>
-        <w:t xml:space="preserve"> sure what </w:t>
+      <w:r>
+        <w:rPr>
+          <w:rFonts w:ascii="Times New Roman" w:hAnsi="Times New Roman"/>
+          <w:sz w:val="20"/>
+        </w:rPr>
+        <w:t xml:space="preserve">Not sure what </w:t>
       </w:r>
       <w:proofErr w:type="spellStart"/>
       <w:r>

</xml_diff>